<commit_message>
Quellen-Migration: Working-Paper-Belege auf begutachtete Endfassungen (BSB)
Alle migrierten Fußnoten am Volltext der Verlagsfassung neu verifiziert:
- Gu/Kelly/Xiu -> RFS 2020 (S. 2223-2234)
- DeMiguel et al. -> RFS 2009 (S. 1915/1916/1942); Simulationszahlen
  korrigiert: 3000/6000 Monate statt "50/500/1000 Jahre" (Working-Paper-Werte)
- Jagannathan/Ma -> Journal of Finance 2003 (S. 1651/1657)
- Wolf -> Ledoit/Wolf 2008, Journal of Empirical Finance (S. 850-854);
  Autorwechsel im Text und Literaturverzeichnis
- Chopra/Ziemba: Seitenkorrektur S. 9 -> S. 10 (Implications and Conclusions)

Literaturverzeichnis (4 Eintraege + Praeambel) angepasst, docx neu gebaut
(114 Fussnoten). STATUS.md aktualisiert.

Co-Authored-By: Claude Opus 4.8 <noreply@anthropic.com>
</commit_message>
<xml_diff>
--- a/arbeit/W-Seminararbeit.docx
+++ b/arbeit/W-Seminararbeit.docx
@@ -442,7 +442,7 @@
     </w:p>
     <w:bookmarkEnd w:id="14"/>
     <w:bookmarkEnd w:id="15"/>
-    <w:bookmarkStart w:id="84" w:name="X755ea9fba24d7bd83bac3177d33a2b4bdfbef71"/>
+    <w:bookmarkStart w:id="85" w:name="X755ea9fba24d7bd83bac3177d33a2b4bdfbef71"/>
     <w:p>
       <w:pPr>
         <w:pStyle w:val="Heading1"/>
@@ -4244,7 +4244,7 @@
       </w:r>
     </w:p>
     <w:bookmarkEnd w:id="71"/>
-    <w:bookmarkStart w:id="77" w:name="die-naive-1n-strategie-als-maßstab"/>
+    <w:bookmarkStart w:id="78" w:name="die-naive-1n-strategie-als-maßstab"/>
     <w:p>
       <w:pPr>
         <w:pStyle w:val="Heading2"/>
@@ -4296,7 +4296,7 @@
         <w:t xml:space="preserve"> </w:t>
       </w:r>
       <w:r>
-        <w:t xml:space="preserve">Ihr zentrales Ergebnis lautet, dass die 1/N-Regel „far from inefficient” ist: Out-of-sample weist sie häufig eine höhere Sharpe Ratio und einen geringeren Umschlag (Turnover) auf als die statischen und dynamischen Optimierungsmodelle.</w:t>
+        <w:t xml:space="preserve">Ihr zentrales Ergebnis lautet, dass keines der vierzehn untersuchten Optimierungsmodelle die 1/N-Regel über sieben Datensätze hinweg konsistent schlägt – weder bei der Sharpe Ratio noch beim Sicherheitsäquivalent (CEQ) oder beim Umschlag (Turnover).</w:t>
       </w:r>
       <w:r>
         <w:rPr>
@@ -4308,7 +4308,7 @@
         <w:t xml:space="preserve"> </w:t>
       </w:r>
       <w:r>
-        <w:t xml:space="preserve">Der Grund liegt im bereits bekannten Schätzfehler – zwar erreichen die Optimierungsmodelle</w:t>
+        <w:t xml:space="preserve">Der Grund liegt im bereits bekannten Schätzfehler: Zwar erreichen die Optimierungsmodelle</w:t>
       </w:r>
       <w:r>
         <w:t xml:space="preserve"> </w:t>
@@ -4352,7 +4352,7 @@
         <w:t xml:space="preserve"> </w:t>
       </w:r>
       <w:r>
-        <w:t xml:space="preserve">Wie schwerwiegend das Schätzproblem ist, verdeutlichen ihre Simulationen: Damit die klassische Mean-Variance-Politik (mit Maximum-Likelihood-Schätzern) die 1/N-Regel schlägt, ist bei vier Anlagen mit 20 % durchschnittlicher idiosynkratischer Volatilität ein Schätzfenster von 50 Jahren erforderlich; sinkt die Volatilität auf 10 %, sind es bereits 500 Jahre, und bei 100 Anlagen mehr als 1000 Jahre.</w:t>
+        <w:t xml:space="preserve">Wie schwerwiegend das Schätzproblem ist, verdeutlichen ihre analytischen und simulationsgestützten Ergebnisse: Damit die stichprobenbasierte Mean-Variance-Strategie die 1/N-Regel im Mittel übertrifft, ist – kalibriert auf den US-Aktienmarkt – bei 25 Anlagen ein Schätzfenster von rund 3000 Monaten (etwa 250 Jahren) und bei 50 Anlagen von rund 6000 Monaten (etwa 500 Jahren) erforderlich.</w:t>
       </w:r>
       <w:r>
         <w:rPr>
@@ -4364,11 +4364,23 @@
         <w:t xml:space="preserve"> </w:t>
       </w:r>
       <w:r>
+        <w:t xml:space="preserve">In ihren Simulationen erreicht die stichprobenbasierte Optimierung bei 25 und 50 Anlagen selbst mit einem Schätzfenster von 6000 Monaten (500 Jahren) nicht einmal die Sharpe Ratio der 1/N-Regel.</w:t>
+      </w:r>
+      <w:r>
+        <w:rPr>
+          <w:rStyle w:val="FootnoteReference"/>
+        </w:rPr>
+        <w:footnoteReference w:id="77"/>
+      </w:r>
+      <w:r>
+        <w:t xml:space="preserve"> </w:t>
+      </w:r>
+      <w:r>
         <w:t xml:space="preserve">Die 1/N-Strategie ist somit kein bloßer Strohmann, sondern ein anspruchsvoller Maßstab – und genau in dieser Funktion dient sie auch in der vorliegenden Arbeit als Benchmark (Equal Weight).</w:t>
       </w:r>
     </w:p>
-    <w:bookmarkEnd w:id="77"/>
-    <w:bookmarkStart w:id="83" w:name="Xd2851ae61e417e64abc3e853315fa3af0eef789"/>
+    <w:bookmarkEnd w:id="78"/>
+    <w:bookmarkStart w:id="84" w:name="Xd2851ae61e417e64abc3e853315fa3af0eef789"/>
     <w:p>
       <w:pPr>
         <w:pStyle w:val="Heading2"/>
@@ -4436,7 +4448,7 @@
         <w:rPr>
           <w:rStyle w:val="FootnoteReference"/>
         </w:rPr>
-        <w:footnoteReference w:id="78"/>
+        <w:footnoteReference w:id="79"/>
       </w:r>
       <w:r>
         <w:t xml:space="preserve"> </w:t>
@@ -4448,7 +4460,7 @@
         <w:rPr>
           <w:rStyle w:val="FootnoteReference"/>
         </w:rPr>
-        <w:footnoteReference w:id="79"/>
+        <w:footnoteReference w:id="80"/>
       </w:r>
     </w:p>
     <w:p>
@@ -4834,7 +4846,7 @@
         <w:rPr>
           <w:rStyle w:val="FootnoteReference"/>
         </w:rPr>
-        <w:footnoteReference w:id="80"/>
+        <w:footnoteReference w:id="81"/>
       </w:r>
       <w:r>
         <w:t xml:space="preserve"> </w:t>
@@ -4974,7 +4986,7 @@
         <w:rPr>
           <w:rStyle w:val="FootnoteReference"/>
         </w:rPr>
-        <w:footnoteReference w:id="81"/>
+        <w:footnoteReference w:id="82"/>
       </w:r>
       <w:r>
         <w:t xml:space="preserve">:</w:t>
@@ -5349,7 +5361,7 @@
         <w:rPr>
           <w:rStyle w:val="FootnoteReference"/>
         </w:rPr>
-        <w:footnoteReference w:id="82"/>
+        <w:footnoteReference w:id="83"/>
       </w:r>
       <w:r>
         <w:t xml:space="preserve"> </w:t>
@@ -5358,9 +5370,9 @@
         <w:t xml:space="preserve">Anders als die 1/N-Regel berücksichtigt Risk Parity damit Volatilitäten und Korrelationen, anders als die Markowitz-Optimierung vermeidet es jedoch die fehleranfällige Renditeschätzung gänzlich. Die vorliegende Arbeit führt Risk Parity als zusätzliche, rein risikobasierte Vergleichsstrategie.</w:t>
       </w:r>
     </w:p>
-    <w:bookmarkEnd w:id="83"/>
     <w:bookmarkEnd w:id="84"/>
-    <w:bookmarkStart w:id="104" w:name="random-forest-gestützte-renditeprognose"/>
+    <w:bookmarkEnd w:id="85"/>
+    <w:bookmarkStart w:id="105" w:name="random-forest-gestützte-renditeprognose"/>
     <w:p>
       <w:pPr>
         <w:pStyle w:val="Heading1"/>
@@ -5369,7 +5381,7 @@
         <w:t xml:space="preserve">3 Random-Forest-gestützte Renditeprognose</w:t>
       </w:r>
     </w:p>
-    <w:bookmarkStart w:id="86" w:name="X0e9b36f9e64c501aa39a42e25ac51a14c97dc68"/>
+    <w:bookmarkStart w:id="87" w:name="X0e9b36f9e64c501aa39a42e25ac51a14c97dc68"/>
     <w:p>
       <w:pPr>
         <w:pStyle w:val="Heading2"/>
@@ -5550,7 +5562,7 @@
         <w:rPr>
           <w:rStyle w:val="FootnoteReference"/>
         </w:rPr>
-        <w:footnoteReference w:id="85"/>
+        <w:footnoteReference w:id="86"/>
       </w:r>
       <w:r>
         <w:t xml:space="preserve"> </w:t>
@@ -5572,8 +5584,8 @@
         <w:t xml:space="preserve">: Ein Modell, das die Trainingsdaten zu genau nachbildet, lernt deren Zufallsrauschen mit und sagt neue Daten schlecht vorher (Überanpassung). Genau dieses Problem adressiert der Random Forest auf konstruktive Weise.</w:t>
       </w:r>
     </w:p>
-    <w:bookmarkEnd w:id="86"/>
-    <w:bookmarkStart w:id="89" w:name="entscheidungsbäume-als-bausteine"/>
+    <w:bookmarkEnd w:id="87"/>
+    <w:bookmarkStart w:id="90" w:name="entscheidungsbäume-als-bausteine"/>
     <w:p>
       <w:pPr>
         <w:pStyle w:val="Heading2"/>
@@ -5603,7 +5615,7 @@
         <w:rPr>
           <w:rStyle w:val="FootnoteReference"/>
         </w:rPr>
-        <w:footnoteReference w:id="87"/>
+        <w:footnoteReference w:id="88"/>
       </w:r>
       <w:r>
         <w:t xml:space="preserve"> </w:t>
@@ -5615,7 +5627,7 @@
         <w:rPr>
           <w:rStyle w:val="FootnoteReference"/>
         </w:rPr>
-        <w:footnoteReference w:id="88"/>
+        <w:footnoteReference w:id="89"/>
       </w:r>
       <w:r>
         <w:t xml:space="preserve"> </w:t>
@@ -5624,8 +5636,8 @@
         <w:t xml:space="preserve">Erst die Kombination vieler Bäume macht das Verfahren leistungsfähig.</w:t>
       </w:r>
     </w:p>
-    <w:bookmarkEnd w:id="89"/>
-    <w:bookmarkStart w:id="96" w:name="Xa3aecce1af409174a88ace5cb9e880da6bb7e3a"/>
+    <w:bookmarkEnd w:id="90"/>
+    <w:bookmarkStart w:id="97" w:name="Xa3aecce1af409174a88ace5cb9e880da6bb7e3a"/>
     <w:p>
       <w:pPr>
         <w:pStyle w:val="Heading2"/>
@@ -5730,7 +5742,7 @@
         <w:rPr>
           <w:rStyle w:val="FootnoteReference"/>
         </w:rPr>
-        <w:footnoteReference w:id="90"/>
+        <w:footnoteReference w:id="91"/>
       </w:r>
       <w:r>
         <w:t xml:space="preserve"> </w:t>
@@ -5781,7 +5793,7 @@
         <w:rPr>
           <w:rStyle w:val="FootnoteReference"/>
         </w:rPr>
-        <w:footnoteReference w:id="91"/>
+        <w:footnoteReference w:id="92"/>
       </w:r>
       <w:r>
         <w:t xml:space="preserve"> </w:t>
@@ -5806,7 +5818,7 @@
         <w:rPr>
           <w:rStyle w:val="FootnoteReference"/>
         </w:rPr>
-        <w:footnoteReference w:id="92"/>
+        <w:footnoteReference w:id="93"/>
       </w:r>
     </w:p>
     <w:p>
@@ -5820,7 +5832,7 @@
         <w:rPr>
           <w:rStyle w:val="FootnoteReference"/>
         </w:rPr>
-        <w:footnoteReference w:id="93"/>
+        <w:footnoteReference w:id="94"/>
       </w:r>
       <w:r>
         <w:t xml:space="preserve"> </w:t>
@@ -5954,7 +5966,7 @@
         <w:rPr>
           <w:rStyle w:val="FootnoteReference"/>
         </w:rPr>
-        <w:footnoteReference w:id="94"/>
+        <w:footnoteReference w:id="95"/>
       </w:r>
       <w:r>
         <w:t xml:space="preserve"> </w:t>
@@ -5998,7 +6010,7 @@
         <w:rPr>
           <w:rStyle w:val="FootnoteReference"/>
         </w:rPr>
-        <w:footnoteReference w:id="95"/>
+        <w:footnoteReference w:id="96"/>
       </w:r>
       <w:r>
         <w:t xml:space="preserve"> </w:t>
@@ -6028,8 +6040,8 @@
         <w:t xml:space="preserve">– er stabilisiert die instabile Einzelprognose, ohne in Überanpassung zu verfallen. Eben diese Eigenschaft macht ihn zu einem Kandidaten für die stark verrauschte Aufgabe der Renditeprognose (Abschnitt 3.4).</w:t>
       </w:r>
     </w:p>
-    <w:bookmarkEnd w:id="96"/>
-    <w:bookmarkStart w:id="103" w:name="X726823064c99e540c40bd3ffa34a3d44b732c78"/>
+    <w:bookmarkEnd w:id="97"/>
+    <w:bookmarkStart w:id="104" w:name="X726823064c99e540c40bd3ffa34a3d44b732c78"/>
     <w:p>
       <w:pPr>
         <w:pStyle w:val="Heading2"/>
@@ -6049,7 +6061,7 @@
         <w:rPr>
           <w:rStyle w:val="FootnoteReference"/>
         </w:rPr>
-        <w:footnoteReference w:id="97"/>
+        <w:footnoteReference w:id="98"/>
       </w:r>
       <w:r>
         <w:t xml:space="preserve"> </w:t>
@@ -6061,7 +6073,7 @@
         <w:rPr>
           <w:rStyle w:val="FootnoteReference"/>
         </w:rPr>
-        <w:footnoteReference w:id="98"/>
+        <w:footnoteReference w:id="99"/>
       </w:r>
       <w:r>
         <w:t xml:space="preserve"> </w:t>
@@ -6098,7 +6110,7 @@
         <w:rPr>
           <w:rStyle w:val="FootnoteReference"/>
         </w:rPr>
-        <w:footnoteReference w:id="99"/>
+        <w:footnoteReference w:id="100"/>
       </w:r>
       <w:r>
         <w:t xml:space="preserve"> </w:t>
@@ -6110,7 +6122,7 @@
         <w:rPr>
           <w:rStyle w:val="FootnoteReference"/>
         </w:rPr>
-        <w:footnoteReference w:id="100"/>
+        <w:footnoteReference w:id="101"/>
       </w:r>
       <w:r>
         <w:t xml:space="preserve"> </w:t>
@@ -6122,7 +6134,7 @@
         <w:rPr>
           <w:rStyle w:val="FootnoteReference"/>
         </w:rPr>
-        <w:footnoteReference w:id="101"/>
+        <w:footnoteReference w:id="102"/>
       </w:r>
       <w:r>
         <w:t xml:space="preserve"> </w:t>
@@ -6134,7 +6146,7 @@
         <w:rPr>
           <w:rStyle w:val="FootnoteReference"/>
         </w:rPr>
-        <w:footnoteReference w:id="102"/>
+        <w:footnoteReference w:id="103"/>
       </w:r>
     </w:p>
     <w:p>
@@ -6145,9 +6157,9 @@
         <w:t xml:space="preserve">Für die vorliegende Arbeit ergeben sich daraus klare Erwartungen: Der Random Forest kann die Renditeschätzung allenfalls geringfügig verbessern, und sein Mehrwert ist keineswegs garantiert, sondern muss – gerade angesichts der Überanpassungsgefahr – sorgfältig gegen die einfacheren Strategien und gegen den Zufall geprüft werden (Kapitel 5).</w:t>
       </w:r>
     </w:p>
-    <w:bookmarkEnd w:id="103"/>
     <w:bookmarkEnd w:id="104"/>
-    <w:bookmarkStart w:id="113" w:name="methodik-des-empirischen-vergleichs"/>
+    <w:bookmarkEnd w:id="105"/>
+    <w:bookmarkStart w:id="114" w:name="methodik-des-empirischen-vergleichs"/>
     <w:p>
       <w:pPr>
         <w:pStyle w:val="Heading1"/>
@@ -6156,7 +6168,7 @@
         <w:t xml:space="preserve">4 Methodik des empirischen Vergleichs</w:t>
       </w:r>
     </w:p>
-    <w:bookmarkStart w:id="105" w:name="datengrundlage-und-untersuchungsdesign"/>
+    <w:bookmarkStart w:id="106" w:name="datengrundlage-und-untersuchungsdesign"/>
     <w:p>
       <w:pPr>
         <w:pStyle w:val="Heading2"/>
@@ -6263,8 +6275,8 @@
         <w:t xml:space="preserve">. Diese Wahl ist bewusst: Nur bei einfachen Renditen ist die Portfoliorendite exakt die gewichtete Summe der Einzelrenditen (vgl. Abschnitt 2.3) – eine Eigenschaft, die logarithmische Renditen über mehrere Anlagen hinweg nicht besitzen. Da das Universum ausschließlich aus heute noch existierenden Titeln besteht, unterliegt die Untersuchung einem Survivorship Bias, der in Kapitel 8 ausführlich gewürdigt wird.</w:t>
       </w:r>
     </w:p>
-    <w:bookmarkEnd w:id="105"/>
-    <w:bookmarkStart w:id="108" w:name="merkmalsbildung-feature-engineering"/>
+    <w:bookmarkEnd w:id="106"/>
+    <w:bookmarkStart w:id="109" w:name="merkmalsbildung-feature-engineering"/>
     <w:p>
       <w:pPr>
         <w:pStyle w:val="Heading2"/>
@@ -6300,7 +6312,7 @@
         <w:rPr>
           <w:rStyle w:val="FootnoteReference"/>
         </w:rPr>
-        <w:footnoteReference w:id="106"/>
+        <w:footnoteReference w:id="107"/>
       </w:r>
       <w:r>
         <w:t xml:space="preserve"> </w:t>
@@ -6312,7 +6324,7 @@
         <w:rPr>
           <w:rStyle w:val="FootnoteReference"/>
         </w:rPr>
-        <w:footnoteReference w:id="107"/>
+        <w:footnoteReference w:id="108"/>
       </w:r>
       <w:r>
         <w:t xml:space="preserve"> </w:t>
@@ -6321,8 +6333,8 @@
         <w:t xml:space="preserve">Die konkreten Berechnungsformeln der übrigen Indikatoren (RSI, MACD, Bollinger-Bänder) folgen der etablierten technischen Analyse und werden hier nicht im Einzelnen hergeleitet.</w:t>
       </w:r>
     </w:p>
-    <w:bookmarkEnd w:id="108"/>
-    <w:bookmarkStart w:id="109" w:name="Xd1064583cdbb989eaeca054847607609a27e3b5"/>
+    <w:bookmarkEnd w:id="109"/>
+    <w:bookmarkStart w:id="110" w:name="Xd1064583cdbb989eaeca054847607609a27e3b5"/>
     <w:p>
       <w:pPr>
         <w:pStyle w:val="Heading2"/>
@@ -6371,8 +6383,8 @@
         <w:t xml:space="preserve">– die unbeabsichtigte Verwendung von Zukunftsinformation. Die Untersuchung begegnet ihm auf zwei Ebenen: Die Gewichte eines Monats nutzen nur Daten bis zum vorangehenden Monatsende, und für den Random Forest wird zusätzlich der letzte Trainingsmonat ausgeschlossen, weil dessen Prognoseziel – die Rendite des Folgemonats – sonst in die Halteperiode hineinreichen würde.</w:t>
       </w:r>
     </w:p>
-    <w:bookmarkEnd w:id="109"/>
-    <w:bookmarkStart w:id="110" w:name="transaktionskosten-und-umschlag"/>
+    <w:bookmarkEnd w:id="110"/>
+    <w:bookmarkStart w:id="111" w:name="transaktionskosten-und-umschlag"/>
     <w:p>
       <w:pPr>
         <w:pStyle w:val="Heading2"/>
@@ -6521,8 +6533,8 @@
         <w:t xml:space="preserve">berechnet: Die alten Gewichte werden zunächst um die Kursdrift der Halteperiode angepasst, bevor sie mit den neuen Zielgewichten verglichen werden. Der pauschale Kostensatz ist eine Vereinfachung, die Geld-Brief-Spannen und Markteinfluss vernachlässigt; diese Limitation wird in Kapitel 8 erörtert.</w:t>
       </w:r>
     </w:p>
-    <w:bookmarkEnd w:id="110"/>
-    <w:bookmarkStart w:id="111" w:name="performance-kennzahlen"/>
+    <w:bookmarkEnd w:id="111"/>
+    <w:bookmarkStart w:id="112" w:name="performance-kennzahlen"/>
     <w:p>
       <w:pPr>
         <w:pStyle w:val="Heading2"/>
@@ -6539,8 +6551,8 @@
         <w:t xml:space="preserve">Die Strategien werden anhand mehrerer risikoadjustierter Kennzahlen beurteilt. Die zentrale Größe ist die Sharpe Ratio (Abschnitt 2.5). Ergänzend dienen die durchschnittliche jährliche Wachstumsrate (CAGR), die annualisierte Volatilität, die Sortino Ratio – die im Unterschied zur Sharpe Ratio nur die Abwärtsschwankungen ins Verhältnis setzt –, der maximale Drawdown (der größte zwischenzeitliche Verlust vom Hoch zum Tief) sowie die Calmar Ratio (CAGR im Verhältnis zum maximalen Drawdown). Durchgängig wird ein risikofreier Zins von 4 % p. a. unterstellt; die Annahme eines konstanten Satzes über den gesamten Zeitraum ist eine Vereinfachung (Kapitel 8).</w:t>
       </w:r>
     </w:p>
-    <w:bookmarkEnd w:id="111"/>
-    <w:bookmarkStart w:id="112" w:name="die-vier-verglichenen-strategien"/>
+    <w:bookmarkEnd w:id="112"/>
+    <w:bookmarkStart w:id="113" w:name="die-vier-verglichenen-strategien"/>
     <w:p>
       <w:pPr>
         <w:pStyle w:val="Heading2"/>
@@ -6621,9 +6633,9 @@
         <w:t xml:space="preserve">schließlich gewichtet so, dass jede Anlage denselben Beitrag zum Gesamtrisiko leistet (Abschnitt 2.10), und dient als zusätzliche, rein risikobasierte Vergleichsstrategie.</w:t>
       </w:r>
     </w:p>
-    <w:bookmarkEnd w:id="112"/>
     <w:bookmarkEnd w:id="113"/>
-    <w:bookmarkStart w:id="152" w:name="statistische-signifikanz-und-robustheit"/>
+    <w:bookmarkEnd w:id="114"/>
+    <w:bookmarkStart w:id="153" w:name="statistische-signifikanz-und-robustheit"/>
     <w:p>
       <w:pPr>
         <w:pStyle w:val="Heading1"/>
@@ -6632,7 +6644,7 @@
         <w:t xml:space="preserve">5 Statistische Signifikanz und Robustheit</w:t>
       </w:r>
     </w:p>
-    <w:bookmarkStart w:id="119" w:name="das-grundproblem-zufall-oder-können"/>
+    <w:bookmarkStart w:id="120" w:name="das-grundproblem-zufall-oder-können"/>
     <w:p>
       <w:pPr>
         <w:pStyle w:val="Heading2"/>
@@ -6652,7 +6664,7 @@
         <w:rPr>
           <w:rStyle w:val="FootnoteReference"/>
         </w:rPr>
-        <w:footnoteReference w:id="114"/>
+        <w:footnoteReference w:id="115"/>
       </w:r>
       <w:r>
         <w:t xml:space="preserve"> </w:t>
@@ -6664,7 +6676,7 @@
         <w:rPr>
           <w:rStyle w:val="FootnoteReference"/>
         </w:rPr>
-        <w:footnoteReference w:id="115"/>
+        <w:footnoteReference w:id="116"/>
       </w:r>
       <w:r>
         <w:t xml:space="preserve"> </w:t>
@@ -6710,13 +6722,13 @@
         <w:pStyle w:val="BodyText"/>
       </w:pPr>
       <w:r>
-        <w:t xml:space="preserve">Der naheliegende formale Test auf Gleichheit zweier Sharpe Ratios ist jener von Jobson und Korkie (1981) in der durch Memmel (2003) korrigierten Fassung. Wolf zeigt jedoch, dass dieser Test ungültig wird, sobald die Renditen schwerere Ränder als die Normalverteilung aufweisen oder zeitlich abhängig sind.</w:t>
-      </w:r>
-      <w:r>
-        <w:rPr>
-          <w:rStyle w:val="FootnoteReference"/>
-        </w:rPr>
-        <w:footnoteReference w:id="116"/>
+        <w:t xml:space="preserve">Der naheliegende formale Test auf Gleichheit zweier Sharpe Ratios ist jener von Jobson und Korkie (1981) in der durch Memmel (2003) korrigierten Fassung. Ledoit und Wolf zeigen jedoch, dass dieser Test ungültig wird, sobald die Renditen schwerere Ränder als die Normalverteilung aufweisen oder zeitlich abhängig sind.</w:t>
+      </w:r>
+      <w:r>
+        <w:rPr>
+          <w:rStyle w:val="FootnoteReference"/>
+        </w:rPr>
+        <w:footnoteReference w:id="117"/>
       </w:r>
       <w:r>
         <w:t xml:space="preserve"> </w:t>
@@ -6728,7 +6740,7 @@
         <w:rPr>
           <w:rStyle w:val="FootnoteReference"/>
         </w:rPr>
-        <w:footnoteReference w:id="117"/>
+        <w:footnoteReference w:id="118"/>
       </w:r>
       <w:r>
         <w:t xml:space="preserve"> </w:t>
@@ -6740,7 +6752,7 @@
         <w:rPr>
           <w:rStyle w:val="FootnoteReference"/>
         </w:rPr>
-        <w:footnoteReference w:id="118"/>
+        <w:footnoteReference w:id="119"/>
       </w:r>
       <w:r>
         <w:t xml:space="preserve"> </w:t>
@@ -6749,8 +6761,8 @@
         <w:t xml:space="preserve">Ein belastbarer Vergleich erfordert daher ein robusteres Verfahren.</w:t>
       </w:r>
     </w:p>
-    <w:bookmarkEnd w:id="119"/>
-    <w:bookmarkStart w:id="129" w:name="der-robuste-sharpe-differenz-test"/>
+    <w:bookmarkEnd w:id="120"/>
+    <w:bookmarkStart w:id="130" w:name="der-robuste-sharpe-differenz-test"/>
     <w:p>
       <w:pPr>
         <w:pStyle w:val="Heading2"/>
@@ -6764,7 +6776,7 @@
         <w:pStyle w:val="FirstParagraph"/>
       </w:pPr>
       <w:r>
-        <w:t xml:space="preserve">Wolf schlägt vor, die Differenz der beiden Sharpe Ratios,</w:t>
+        <w:t xml:space="preserve">Ledoit und Wolf schlagen vor, die Differenz der beiden Sharpe Ratios,</w:t>
       </w:r>
       <w:r>
         <w:t xml:space="preserve"> </w:t>
@@ -6826,7 +6838,7 @@
         <w:rPr>
           <w:rStyle w:val="FootnoteReference"/>
         </w:rPr>
-        <w:footnoteReference w:id="120"/>
+        <w:footnoteReference w:id="121"/>
       </w:r>
       <w:r>
         <w:t xml:space="preserve"> </w:t>
@@ -6891,7 +6903,7 @@
         <w:rPr>
           <w:rStyle w:val="FootnoteReference"/>
         </w:rPr>
-        <w:footnoteReference w:id="121"/>
+        <w:footnoteReference w:id="122"/>
       </w:r>
       <w:r>
         <w:t xml:space="preserve"> </w:t>
@@ -6903,7 +6915,7 @@
         <w:rPr>
           <w:rStyle w:val="FootnoteReference"/>
         </w:rPr>
-        <w:footnoteReference w:id="122"/>
+        <w:footnoteReference w:id="123"/>
       </w:r>
     </w:p>
     <w:p>
@@ -6917,13 +6929,13 @@
         <w:rPr>
           <w:rStyle w:val="FootnoteReference"/>
         </w:rPr>
-        <w:footnoteReference w:id="123"/>
-      </w:r>
-      <w:r>
-        <w:t xml:space="preserve"> </w:t>
-      </w:r>
-      <w:r>
-        <w:t xml:space="preserve">empfiehlt Wolf ein verbessertes Verfahren: einen</w:t>
+        <w:footnoteReference w:id="124"/>
+      </w:r>
+      <w:r>
+        <w:t xml:space="preserve"> </w:t>
+      </w:r>
+      <w:r>
+        <w:t xml:space="preserve">empfehlen Ledoit und Wolf ein verbessertes Verfahren: einen</w:t>
       </w:r>
       <w:r>
         <w:t xml:space="preserve"> </w:t>
@@ -6959,7 +6971,7 @@
         <w:rPr>
           <w:rStyle w:val="FootnoteReference"/>
         </w:rPr>
-        <w:footnoteReference w:id="124"/>
+        <w:footnoteReference w:id="125"/>
       </w:r>
       <w:r>
         <w:t xml:space="preserve"> </w:t>
@@ -6971,13 +6983,13 @@
         <w:rPr>
           <w:rStyle w:val="FootnoteReference"/>
         </w:rPr>
-        <w:footnoteReference w:id="125"/>
-      </w:r>
-      <w:r>
-        <w:t xml:space="preserve"> </w:t>
-      </w:r>
-      <w:r>
-        <w:t xml:space="preserve">Für die zeitabhängigen Finanzdaten verwendet Wolf den</w:t>
+        <w:footnoteReference w:id="126"/>
+      </w:r>
+      <w:r>
+        <w:t xml:space="preserve"> </w:t>
+      </w:r>
+      <w:r>
+        <w:t xml:space="preserve">Für die zeitabhängigen Finanzdaten verwenden Ledoit und Wolf den</w:t>
       </w:r>
       <w:r>
         <w:t xml:space="preserve"> </w:t>
@@ -6996,7 +7008,7 @@
         <w:rPr>
           <w:rStyle w:val="FootnoteReference"/>
         </w:rPr>
-        <w:footnoteReference w:id="126"/>
+        <w:footnoteReference w:id="127"/>
       </w:r>
       <w:r>
         <w:t xml:space="preserve"> </w:t>
@@ -7008,7 +7020,7 @@
         <w:rPr>
           <w:rStyle w:val="FootnoteReference"/>
         </w:rPr>
-        <w:footnoteReference w:id="127"/>
+        <w:footnoteReference w:id="128"/>
       </w:r>
       <w:r>
         <w:t xml:space="preserve"> </w:t>
@@ -7020,7 +7032,7 @@
         <w:rPr>
           <w:rStyle w:val="FootnoteReference"/>
         </w:rPr>
-        <w:footnoteReference w:id="128"/>
+        <w:footnoteReference w:id="129"/>
       </w:r>
       <w:r>
         <w:t xml:space="preserve"> </w:t>
@@ -7029,8 +7041,8 @@
         <w:t xml:space="preserve">Genau dieser Test bildet das zentrale Signifikanzwerkzeug der vorliegenden Arbeit.</w:t>
       </w:r>
     </w:p>
-    <w:bookmarkEnd w:id="129"/>
-    <w:bookmarkStart w:id="136" w:name="das-problem-des-multiplen-testens"/>
+    <w:bookmarkEnd w:id="130"/>
+    <w:bookmarkStart w:id="137" w:name="das-problem-des-multiplen-testens"/>
     <w:p>
       <w:pPr>
         <w:pStyle w:val="Heading2"/>
@@ -7066,7 +7078,7 @@
         <w:rPr>
           <w:rStyle w:val="FootnoteReference"/>
         </w:rPr>
-        <w:footnoteReference w:id="130"/>
+        <w:footnoteReference w:id="131"/>
       </w:r>
       <w:r>
         <w:t xml:space="preserve"> </w:t>
@@ -7078,7 +7090,7 @@
         <w:rPr>
           <w:rStyle w:val="FootnoteReference"/>
         </w:rPr>
-        <w:footnoteReference w:id="131"/>
+        <w:footnoteReference w:id="132"/>
       </w:r>
     </w:p>
     <w:p>
@@ -7108,7 +7120,7 @@
         <w:rPr>
           <w:rStyle w:val="FootnoteReference"/>
         </w:rPr>
-        <w:footnoteReference w:id="132"/>
+        <w:footnoteReference w:id="133"/>
       </w:r>
       <w:r>
         <w:t xml:space="preserve"> </w:t>
@@ -7134,7 +7146,7 @@
         <w:rPr>
           <w:rStyle w:val="FootnoteReference"/>
         </w:rPr>
-        <w:footnoteReference w:id="133"/>
+        <w:footnoteReference w:id="134"/>
       </w:r>
       <w:r>
         <w:t xml:space="preserve"> </w:t>
@@ -7178,7 +7190,7 @@
         <w:rPr>
           <w:rStyle w:val="FootnoteReference"/>
         </w:rPr>
-        <w:footnoteReference w:id="134"/>
+        <w:footnoteReference w:id="135"/>
       </w:r>
       <w:r>
         <w:t xml:space="preserve"> </w:t>
@@ -7204,7 +7216,7 @@
         <w:rPr>
           <w:rStyle w:val="FootnoteReference"/>
         </w:rPr>
-        <w:footnoteReference w:id="135"/>
+        <w:footnoteReference w:id="136"/>
       </w:r>
       <w:r>
         <w:t xml:space="preserve"> </w:t>
@@ -7213,8 +7225,8 @@
         <w:t xml:space="preserve">Die vorliegende Arbeit wendet die Holm-Korrektur auf ihre fünf paarweisen Strategievergleiche an, sodass ein als signifikant ausgewiesener Unterschied auch der Korrektur für multiples Testen standhält.</w:t>
       </w:r>
     </w:p>
-    <w:bookmarkEnd w:id="136"/>
-    <w:bookmarkStart w:id="145" w:name="X4977f6fab2ab33ba270d7c6eec7285dacd7883a"/>
+    <w:bookmarkEnd w:id="137"/>
+    <w:bookmarkStart w:id="146" w:name="X4977f6fab2ab33ba270d7c6eec7285dacd7883a"/>
     <w:p>
       <w:pPr>
         <w:pStyle w:val="Heading2"/>
@@ -7266,7 +7278,7 @@
         <w:rPr>
           <w:rStyle w:val="FootnoteReference"/>
         </w:rPr>
-        <w:footnoteReference w:id="137"/>
+        <w:footnoteReference w:id="138"/>
       </w:r>
       <w:r>
         <w:t xml:space="preserve"> </w:t>
@@ -7294,7 +7306,7 @@
         <w:rPr>
           <w:rStyle w:val="FootnoteReference"/>
         </w:rPr>
-        <w:footnoteReference w:id="138"/>
+        <w:footnoteReference w:id="139"/>
       </w:r>
       <w:r>
         <w:t xml:space="preserve"> </w:t>
@@ -7306,7 +7318,7 @@
         <w:rPr>
           <w:rStyle w:val="FootnoteReference"/>
         </w:rPr>
-        <w:footnoteReference w:id="139"/>
+        <w:footnoteReference w:id="140"/>
       </w:r>
       <w:r>
         <w:t xml:space="preserve"> </w:t>
@@ -7318,7 +7330,7 @@
         <w:rPr>
           <w:rStyle w:val="FootnoteReference"/>
         </w:rPr>
-        <w:footnoteReference w:id="140"/>
+        <w:footnoteReference w:id="141"/>
       </w:r>
     </w:p>
     <w:p>
@@ -7348,7 +7360,7 @@
         <w:rPr>
           <w:rStyle w:val="FootnoteReference"/>
         </w:rPr>
-        <w:footnoteReference w:id="141"/>
+        <w:footnoteReference w:id="142"/>
       </w:r>
       <w:r>
         <w:t xml:space="preserve"> </w:t>
@@ -7390,7 +7402,7 @@
         <w:rPr>
           <w:rStyle w:val="FootnoteReference"/>
         </w:rPr>
-        <w:footnoteReference w:id="142"/>
+        <w:footnoteReference w:id="143"/>
       </w:r>
       <w:r>
         <w:t xml:space="preserve"> </w:t>
@@ -7402,7 +7414,7 @@
         <w:rPr>
           <w:rStyle w:val="FootnoteReference"/>
         </w:rPr>
-        <w:footnoteReference w:id="143"/>
+        <w:footnoteReference w:id="144"/>
       </w:r>
       <w:r>
         <w:t xml:space="preserve"> </w:t>
@@ -7414,7 +7426,7 @@
         <w:rPr>
           <w:rStyle w:val="FootnoteReference"/>
         </w:rPr>
-        <w:footnoteReference w:id="144"/>
+        <w:footnoteReference w:id="145"/>
       </w:r>
       <w:r>
         <w:t xml:space="preserve"> </w:t>
@@ -7423,8 +7435,8 @@
         <w:t xml:space="preserve">Die vorliegende Arbeit berechnet die DSR für jede der vier Strategien, um deren Sharpe Ratios gegen Selektionsverzerrung und schwere Verteilungsränder abzusichern.</w:t>
       </w:r>
     </w:p>
-    <w:bookmarkEnd w:id="145"/>
-    <w:bookmarkStart w:id="151" w:name="Xc57e80040acf2e538da00c47343d5dbd9fb962e"/>
+    <w:bookmarkEnd w:id="146"/>
+    <w:bookmarkStart w:id="152" w:name="Xc57e80040acf2e538da00c47343d5dbd9fb962e"/>
     <w:p>
       <w:pPr>
         <w:pStyle w:val="Heading2"/>
@@ -7444,7 +7456,7 @@
         <w:rPr>
           <w:rStyle w:val="FootnoteReference"/>
         </w:rPr>
-        <w:footnoteReference w:id="146"/>
+        <w:footnoteReference w:id="147"/>
       </w:r>
       <w:r>
         <w:t xml:space="preserve"> </w:t>
@@ -7566,7 +7578,7 @@
         <w:rPr>
           <w:rStyle w:val="FootnoteReference"/>
         </w:rPr>
-        <w:footnoteReference w:id="147"/>
+        <w:footnoteReference w:id="148"/>
       </w:r>
     </w:p>
     <w:p>
@@ -7596,7 +7608,7 @@
         <w:rPr>
           <w:rStyle w:val="FootnoteReference"/>
         </w:rPr>
-        <w:footnoteReference w:id="148"/>
+        <w:footnoteReference w:id="149"/>
       </w:r>
       <w:r>
         <w:t xml:space="preserve"> </w:t>
@@ -7624,7 +7636,7 @@
         <w:rPr>
           <w:rStyle w:val="FootnoteReference"/>
         </w:rPr>
-        <w:footnoteReference w:id="149"/>
+        <w:footnoteReference w:id="150"/>
       </w:r>
       <w:r>
         <w:t xml:space="preserve"> </w:t>
@@ -7706,7 +7718,7 @@
         <w:rPr>
           <w:rStyle w:val="FootnoteReference"/>
         </w:rPr>
-        <w:footnoteReference w:id="150"/>
+        <w:footnoteReference w:id="151"/>
       </w:r>
       <w:r>
         <w:t xml:space="preserve"> </w:t>
@@ -7715,9 +7727,9 @@
         <w:t xml:space="preserve">Die vorliegende Arbeit setzt dieses Verfahren als zuschaltbare Option im Hyperparameter-Tuning des Random Forest um und begegnet damit dem Informationsleck der überlappenden Monatslabels.</w:t>
       </w:r>
     </w:p>
-    <w:bookmarkEnd w:id="151"/>
     <w:bookmarkEnd w:id="152"/>
-    <w:bookmarkStart w:id="155" w:name="implementierung"/>
+    <w:bookmarkEnd w:id="153"/>
+    <w:bookmarkStart w:id="156" w:name="implementierung"/>
     <w:p>
       <w:pPr>
         <w:pStyle w:val="Heading1"/>
@@ -7726,7 +7738,7 @@
         <w:t xml:space="preserve">6 Implementierung</w:t>
       </w:r>
     </w:p>
-    <w:bookmarkStart w:id="153" w:name="architektur-und-reproduzierbarkeit"/>
+    <w:bookmarkStart w:id="154" w:name="architektur-und-reproduzierbarkeit"/>
     <w:p>
       <w:pPr>
         <w:pStyle w:val="Heading2"/>
@@ -7743,8 +7755,8 @@
         <w:t xml:space="preserve">Die Untersuchung ist vollständig in Python umgesetzt. Der Code ist als modulares Paket organisiert, dessen Module den Bausteinen dieser Arbeit entsprechen: Datenbeschaffung, technische Indikatoren, die drei Optimierer (Markowitz, Risk Parity, Random Forest), die Backtest-Engine, die Kennzahlenberechnung, das Signifikanzmodul sowie die Visualisierung. Verwendet werden etablierte wissenschaftliche Bibliotheken (unter anderem NumPy, pandas, scikit-learn und SciPy). Zur Sicherung der Reproduzierbarkeit werden alle Zufallsprozesse mit festen Startwerten (Seeds) initialisiert, sämtliche Parameter in einer zentralen Konfiguration gehalten, die Ergebnisse als CSV- und JSON-Dateien protokolliert und der gesamte Entwicklungsstand unter Versionskontrolle (Git) geführt. Eine automatisierte Testsuite prüft die Kernfunktionen – etwa die Kennzahlen, die Einhaltung der Optimierer-Nebenbedingungen und den Look-Ahead-Schutz.</w:t>
       </w:r>
     </w:p>
-    <w:bookmarkEnd w:id="153"/>
-    <w:bookmarkStart w:id="154" w:name="kernkomponenten"/>
+    <w:bookmarkEnd w:id="154"/>
+    <w:bookmarkStart w:id="155" w:name="kernkomponenten"/>
     <w:p>
       <w:pPr>
         <w:pStyle w:val="Heading2"/>
@@ -7863,9 +7875,9 @@
         <w:t xml:space="preserve">(Abschnitte 2.4 und 2.8); gelöst wird mit dem SLSQP-Verfahren der Bibliothek SciPy. Der Random Forest wird zu jedem Rebalancing-Termin über eine randomisierte Hyperparametersuche mit Zeitreihen-Kreuzvalidierung trainiert (Abschnitt 5.5) und prognostiziert die Rendite des Folgemonats, die anschließend als erwartete Rendite in dieselbe Sharpe-Maximierung eingeht. Die Backtest-Engine steuert das rollierende Walk-Forward-Schema (Abschnitt 4.3), verbucht die Transaktionskosten (Abschnitt 4.4) und protokolliert Gewichte, Renditen und Umschlag jeder Periode. Das Signifikanzmodul schließlich implementiert den robusten Sharpe-Differenz-Test, die Holm-Korrektur und die Deflated Sharpe Ratio (Kapitel 5).</w:t>
       </w:r>
     </w:p>
-    <w:bookmarkEnd w:id="154"/>
     <w:bookmarkEnd w:id="155"/>
-    <w:bookmarkStart w:id="159" w:name="ergebnisse"/>
+    <w:bookmarkEnd w:id="156"/>
+    <w:bookmarkStart w:id="160" w:name="ergebnisse"/>
     <w:p>
       <w:pPr>
         <w:pStyle w:val="Heading1"/>
@@ -7874,7 +7886,7 @@
         <w:t xml:space="preserve">7 Ergebnisse</w:t>
       </w:r>
     </w:p>
-    <w:bookmarkStart w:id="156" w:name="performance-der-vier-strategien"/>
+    <w:bookmarkStart w:id="157" w:name="performance-der-vier-strategien"/>
     <w:p>
       <w:pPr>
         <w:pStyle w:val="Heading2"/>
@@ -8201,8 +8213,8 @@
         <w:t xml:space="preserve">Gemessen an den Punktschätzern rangiert der Random Forest mit einer Sharpe Ratio von 1,01 knapp vorn, gefolgt von Markowitz (0,92) und Equal Weight (0,91), die praktisch gleichauf liegen; Risk Parity bildet mit 0,79 das Schlusslicht. Bemerkenswert ist bereits hier, dass die aufwändigen Optimierungsverfahren die naive 1/N-Strategie nur geringfügig (Random Forest) bzw. kaum (Markowitz) übertreffen – ein erstes Indiz im Sinne des Befundes von DeMiguel, Garlappi und Uppal (Abschnitt 2.9).</w:t>
       </w:r>
     </w:p>
-    <w:bookmarkEnd w:id="156"/>
-    <w:bookmarkStart w:id="157" w:name="X00b641efc050fa26c9cbcca4f219c205baa1dc2"/>
+    <w:bookmarkEnd w:id="157"/>
+    <w:bookmarkStart w:id="158" w:name="X00b641efc050fa26c9cbcca4f219c205baa1dc2"/>
     <w:p>
       <w:pPr>
         <w:pStyle w:val="Heading2"/>
@@ -8486,8 +8498,8 @@
         <w:t xml:space="preserve">der aktiven Strategien die naive 1/N-Benchmark in statistisch belastbarer Weise.</w:t>
       </w:r>
     </w:p>
-    <w:bookmarkEnd w:id="157"/>
-    <w:bookmarkStart w:id="158" w:name="deflated-sharpe-ratio"/>
+    <w:bookmarkEnd w:id="158"/>
+    <w:bookmarkStart w:id="159" w:name="deflated-sharpe-ratio"/>
     <w:p>
       <w:pPr>
         <w:pStyle w:val="Heading2"/>
@@ -8520,9 +8532,9 @@
         <w:t xml:space="preserve">untereinander trifft er hingegen keine Aussage.</w:t>
       </w:r>
     </w:p>
-    <w:bookmarkEnd w:id="158"/>
     <w:bookmarkEnd w:id="159"/>
-    <w:bookmarkStart w:id="165" w:name="diskussion-und-kritische-würdigung"/>
+    <w:bookmarkEnd w:id="160"/>
+    <w:bookmarkStart w:id="166" w:name="diskussion-und-kritische-würdigung"/>
     <w:p>
       <w:pPr>
         <w:pStyle w:val="Heading1"/>
@@ -8531,7 +8543,7 @@
         <w:t xml:space="preserve">8 Diskussion und kritische Würdigung</w:t>
       </w:r>
     </w:p>
-    <w:bookmarkStart w:id="160" w:name="einordnung-des-kernbefunds"/>
+    <w:bookmarkStart w:id="161" w:name="einordnung-des-kernbefunds"/>
     <w:p>
       <w:pPr>
         <w:pStyle w:val="Heading2"/>
@@ -8594,8 +8606,8 @@
         <w:t xml:space="preserve">selbst der besten Verfahren nur etwa 0,4 % beträgt, ist ein robust messbarer Performancevorsprung kaum zu erwarten.</w:t>
       </w:r>
     </w:p>
-    <w:bookmarkEnd w:id="160"/>
-    <w:bookmarkStart w:id="162" w:name="survivorship-bias"/>
+    <w:bookmarkEnd w:id="161"/>
+    <w:bookmarkStart w:id="163" w:name="survivorship-bias"/>
     <w:p>
       <w:pPr>
         <w:pStyle w:val="Heading2"/>
@@ -8615,7 +8627,7 @@
         <w:rPr>
           <w:rStyle w:val="FootnoteReference"/>
         </w:rPr>
-        <w:footnoteReference w:id="161"/>
+        <w:footnoteReference w:id="162"/>
       </w:r>
       <w:r>
         <w:t xml:space="preserve"> </w:t>
@@ -8656,8 +8668,8 @@
         <w:t xml:space="preserve">zusammengesetztes Universum vermeiden, das zu jedem Zeitpunkt die tatsächlich gehandelten – einschließlich später ausgeschiedener – Titel enthält; entsprechende Daten standen für diese Arbeit jedoch nicht zur Verfügung. Die Ergebnisse sind daher als relativer Strategievergleich aussagekräftiger denn als Prognose absoluter Renditen.</w:t>
       </w:r>
     </w:p>
-    <w:bookmarkEnd w:id="162"/>
-    <w:bookmarkStart w:id="164" w:name="weitere-limitationen"/>
+    <w:bookmarkEnd w:id="163"/>
+    <w:bookmarkStart w:id="165" w:name="weitere-limitationen"/>
     <w:p>
       <w:pPr>
         <w:pStyle w:val="Heading2"/>
@@ -8677,7 +8689,7 @@
         <w:rPr>
           <w:rStyle w:val="FootnoteReference"/>
         </w:rPr>
-        <w:footnoteReference w:id="163"/>
+        <w:footnoteReference w:id="164"/>
       </w:r>
       <w:r>
         <w:t xml:space="preserve"> </w:t>
@@ -8686,9 +8698,9 @@
         <w:t xml:space="preserve">ein pauschaler Satz unterschätzt somit die Kosten großer Umschichtungen. Drittens beruht die Untersuchung auf einem einzigen historischen Pfad, der von einem überwiegend steigenden Markt geprägt ist; die Ergebnisse sind daher regimeabhängig. Diese Limitationen schmälern die externe Validität, ändern jedoch nichts am methodisch abgesicherten Kernbefund.</w:t>
       </w:r>
     </w:p>
-    <w:bookmarkEnd w:id="164"/>
     <w:bookmarkEnd w:id="165"/>
-    <w:bookmarkStart w:id="168" w:name="fazit-und-ausblick"/>
+    <w:bookmarkEnd w:id="166"/>
+    <w:bookmarkStart w:id="169" w:name="fazit-und-ausblick"/>
     <w:p>
       <w:pPr>
         <w:pStyle w:val="Heading1"/>
@@ -8697,7 +8709,7 @@
         <w:t xml:space="preserve">9 Fazit und Ausblick</w:t>
       </w:r>
     </w:p>
-    <w:bookmarkStart w:id="166" w:name="beantwortung-der-forschungsfrage"/>
+    <w:bookmarkStart w:id="167" w:name="beantwortung-der-forschungsfrage"/>
     <w:p>
       <w:pPr>
         <w:pStyle w:val="Heading2"/>
@@ -8775,8 +8787,8 @@
         <w:t xml:space="preserve">: Die untersuchten Optimierungsverfahren bieten gegenüber der einfachen Gleichgewichtung keinen statistisch gesicherten Mehrwert. Dieses Ergebnis ist kein Misserfolg, sondern eine eigenständige empirische Bestätigung des Befundes von DeMiguel, Garlappi und Uppal und unterstreicht, wie wichtig die Trennung von echtem Können und Zufall in der quantitativen Finanzforschung ist.</w:t>
       </w:r>
     </w:p>
-    <w:bookmarkEnd w:id="166"/>
-    <w:bookmarkStart w:id="167" w:name="ausblick"/>
+    <w:bookmarkEnd w:id="167"/>
+    <w:bookmarkStart w:id="168" w:name="ausblick"/>
     <w:p>
       <w:pPr>
         <w:pStyle w:val="Heading2"/>
@@ -8809,9 +8821,9 @@
         <w:t xml:space="preserve">zusammengesetztes Universum verringern, das ausgeschiedene Titel einschließt. Auf der Modellseite könnten eine zeitvariable bzw. nichtlineare Kovarianzschätzung, das Black-Litterman-Modell zur Stabilisierung der erwarteten Renditen oder ein Ensemble mehrerer ML-Verfahren erprobt werden. Schließlich würde eine Auswertung über mehrere Marktphasen und zusätzliche Datensätze die Robustheit der Befunde weiter absichern.</w:t>
       </w:r>
     </w:p>
-    <w:bookmarkEnd w:id="167"/>
     <w:bookmarkEnd w:id="168"/>
-    <w:bookmarkStart w:id="169" w:name="literaturverzeichnis"/>
+    <w:bookmarkEnd w:id="169"/>
+    <w:bookmarkStart w:id="170" w:name="literaturverzeichnis"/>
     <w:p>
       <w:pPr>
         <w:pStyle w:val="Heading1"/>
@@ -8825,7 +8837,7 @@
         <w:pStyle w:val="FirstParagraph"/>
       </w:pPr>
       <w:r>
-        <w:t xml:space="preserve">Es wurde ausschließlich wissenschaftliche Primärliteratur (Originalaufsätze, Arbeitspapiere und eine Monografie) verwendet; Sekundärliteratur kam nicht zum Einsatz. Mehrere Quellen lagen als Arbeitspapier- bzw. Online-Fassung vor; die Seitenangaben in den Fußnoten beziehen sich auf die jeweils verwendete Fassung.</w:t>
+        <w:t xml:space="preserve">Es wurde ausschließlich wissenschaftliche Primärliteratur (Originalaufsätze, Arbeitspapiere und eine Monografie) verwendet; Sekundärliteratur kam nicht zum Einsatz. Wo eine begutachtete Zeitschriftenveröffentlichung vorlag, wird diese zitiert und die Seitenangaben der Fußnoten beziehen sich auf die endgültige Fassung; einige Quellen lagen nur als Arbeitspapier- bzw. Online-Fassung vor, sodass sich deren Seitenangaben auf die jeweils verwendete Fassung beziehen.</w:t>
       </w:r>
     </w:p>
     <w:p>
@@ -8889,7 +8901,7 @@
         <w:pStyle w:val="BodyText"/>
       </w:pPr>
       <w:r>
-        <w:t xml:space="preserve">DeMiguel, Victor/Garlappi, Lorenzo/Uppal, Raman: How Inefficient is the 1/N Asset-Allocation Strategy?, Arbeitspapier, 1. Dezember 2005 (publiziert als: Optimal Versus Naive Diversification: How Inefficient Is the 1/N Portfolio Strategy?, in: The Review of Financial Studies, Jg. 22, Nr. 5, 2009, S. 1915–1953).</w:t>
+        <w:t xml:space="preserve">DeMiguel, Victor/Garlappi, Lorenzo/Uppal, Raman: Optimal Versus Naive Diversification: How Inefficient Is the 1/N Portfolio Strategy?, in: The Review of Financial Studies, Jg. 22, Nr. 5, 2009, S. 1915–1953.</w:t>
       </w:r>
     </w:p>
     <w:p>
@@ -8897,7 +8909,7 @@
         <w:pStyle w:val="BodyText"/>
       </w:pPr>
       <w:r>
-        <w:t xml:space="preserve">Gu, Shihao/Kelly, Bryan/Xiu, Dacheng: Empirical Asset Pricing via Machine Learning, NBER Working Paper Nr. 25398, National Bureau of Economic Research, 2018, https://www.nber.org/papers/w25398, letzter Aufruf am 21.06.2026 (publiziert in: The Review of Financial Studies, Jg. 33, Nr. 5, 2020, S. 2223–2273).</w:t>
+        <w:t xml:space="preserve">Gu, Shihao/Kelly, Bryan/Xiu, Dacheng: Empirical Asset Pricing via Machine Learning, in: The Review of Financial Studies, Jg. 33, Nr. 5, 2020, S. 2223–2273.</w:t>
       </w:r>
     </w:p>
     <w:p>
@@ -8921,7 +8933,7 @@
         <w:pStyle w:val="BodyText"/>
       </w:pPr>
       <w:r>
-        <w:t xml:space="preserve">Jagannathan, Ravi/Ma, Tongshu: Risk Reduction in Large Portfolios: Why Imposing the Wrong Constraints Helps, NBER Working Paper Nr. 8922, National Bureau of Economic Research, 2002, https://www.nber.org/papers/w8922, letzter Aufruf am 21.06.2026 (publiziert in: The Journal of Finance, Jg. 58, Nr. 4, 2003, S. 1651–1684).</w:t>
+        <w:t xml:space="preserve">Jagannathan, Ravi/Ma, Tongshu: Risk Reduction in Large Portfolios: Why Imposing the Wrong Constraints Helps, in: The Journal of Finance, Jg. 58, Nr. 4, 2003, S. 1651–1683.</w:t>
       </w:r>
     </w:p>
     <w:p>
@@ -8945,6 +8957,14 @@
         <w:pStyle w:val="BodyText"/>
       </w:pPr>
       <w:r>
+        <w:t xml:space="preserve">Ledoit, Olivier/Wolf, Michael: Robust Performance Hypothesis Testing with the Sharpe Ratio, in: Journal of Empirical Finance, Jg. 15, Nr. 5, 2008, S. 850–859.</w:t>
+      </w:r>
+    </w:p>
+    <w:p>
+      <w:pPr>
+        <w:pStyle w:val="BodyText"/>
+      </w:pPr>
+      <w:r>
         <w:t xml:space="preserve">Lo, Andrew W.: The Statistics of Sharpe Ratios, in: Financial Analysts Journal, Jg. 58, Nr. 4, 2002, S. 36–52.</w:t>
       </w:r>
     </w:p>
@@ -9012,15 +9032,7 @@
         <w:t xml:space="preserve">Sharpe, William F.: The Sharpe Ratio, in: The Journal of Portfolio Management, Jg. 21, Nr. 1, 1994, S. 49–58 (zitiert nach dem Online-Nachdruck: https://web.stanford.edu/~wfsharpe/art/sr/sr.htm, letzter Aufruf am 21.06.2026).</w:t>
       </w:r>
     </w:p>
-    <w:p>
-      <w:pPr>
-        <w:pStyle w:val="BodyText"/>
-      </w:pPr>
-      <w:r>
-        <w:t xml:space="preserve">Wolf, Michael: Robust Performance Hypothesis Testing with the Sharpe Ratio, Working Paper Nr. 320, Institute for Empirical Research in Economics, University of Zurich, 2007, https://ssrn.com/abstract=985038, letzter Aufruf am 21.06.2026 (publiziert als: Ledoit, Olivier/Wolf, Michael, in: Journal of Empirical Finance, Jg. 15, Nr. 5, 2008, S. 850–859).</w:t>
-      </w:r>
-    </w:p>
-    <w:bookmarkEnd w:id="169"/>
+    <w:bookmarkEnd w:id="170"/>
     <w:p>
       <w:r>
         <w:br w:type="page"/>
@@ -9152,7 +9164,7 @@
         <w:t xml:space="preserve"> </w:t>
       </w:r>
       <w:r>
-        <w:t xml:space="preserve">DeMiguel et al., S. 3</w:t>
+        <w:t xml:space="preserve">DeMiguel et al., S. 1915</w:t>
       </w:r>
     </w:p>
   </w:footnote>
@@ -9171,7 +9183,7 @@
         <w:t xml:space="preserve"> </w:t>
       </w:r>
       <w:r>
-        <w:t xml:space="preserve">Gu/Kelly/Xiu, PDF-S. 2</w:t>
+        <w:t xml:space="preserve">Gu/Kelly/Xiu, S. 2223</w:t>
       </w:r>
     </w:p>
   </w:footnote>
@@ -9912,7 +9924,7 @@
         <w:t xml:space="preserve"> </w:t>
       </w:r>
       <w:r>
-        <w:t xml:space="preserve">Chopra/Ziemba, S. 9</w:t>
+        <w:t xml:space="preserve">Chopra/Ziemba, S. 10</w:t>
       </w:r>
     </w:p>
   </w:footnote>
@@ -10045,7 +10057,7 @@
         <w:t xml:space="preserve"> </w:t>
       </w:r>
       <w:r>
-        <w:t xml:space="preserve">Jagannathan/Ma 2003, Abstract</w:t>
+        <w:t xml:space="preserve">Jagannathan/Ma, S. 1651</w:t>
       </w:r>
     </w:p>
   </w:footnote>
@@ -10064,7 +10076,7 @@
         <w:t xml:space="preserve"> </w:t>
       </w:r>
       <w:r>
-        <w:t xml:space="preserve">Jagannathan/Ma 2003, Abstract</w:t>
+        <w:t xml:space="preserve">Jagannathan/Ma, S. 1657</w:t>
       </w:r>
     </w:p>
   </w:footnote>
@@ -10083,7 +10095,7 @@
         <w:t xml:space="preserve"> </w:t>
       </w:r>
       <w:r>
-        <w:t xml:space="preserve">Jagannathan/Ma 2003, Abstract</w:t>
+        <w:t xml:space="preserve">Jagannathan/Ma, S. 1651</w:t>
       </w:r>
     </w:p>
   </w:footnote>
@@ -10102,7 +10114,7 @@
         <w:t xml:space="preserve"> </w:t>
       </w:r>
       <w:r>
-        <w:t xml:space="preserve">DeMiguel et al., S. 1</w:t>
+        <w:t xml:space="preserve">DeMiguel et al., S. 1915</w:t>
       </w:r>
     </w:p>
   </w:footnote>
@@ -10121,7 +10133,7 @@
         <w:t xml:space="preserve"> </w:t>
       </w:r>
       <w:r>
-        <w:t xml:space="preserve">DeMiguel et al., S. 1</w:t>
+        <w:t xml:space="preserve">DeMiguel et al., S. 1916</w:t>
       </w:r>
     </w:p>
   </w:footnote>
@@ -10140,7 +10152,7 @@
         <w:t xml:space="preserve"> </w:t>
       </w:r>
       <w:r>
-        <w:t xml:space="preserve">DeMiguel et al., S. 3</w:t>
+        <w:t xml:space="preserve">DeMiguel et al., S. 1915</w:t>
       </w:r>
     </w:p>
   </w:footnote>
@@ -10159,7 +10171,7 @@
         <w:t xml:space="preserve"> </w:t>
       </w:r>
       <w:r>
-        <w:t xml:space="preserve">DeMiguel et al., S. 3</w:t>
+        <w:t xml:space="preserve">DeMiguel et al., S. 1915</w:t>
       </w:r>
     </w:p>
   </w:footnote>
@@ -10178,11 +10190,11 @@
         <w:t xml:space="preserve"> </w:t>
       </w:r>
       <w:r>
-        <w:t xml:space="preserve">DeMiguel et al., S. 3</w:t>
+        <w:t xml:space="preserve">DeMiguel et al., S. 1915</w:t>
       </w:r>
     </w:p>
   </w:footnote>
-  <w:footnote w:id="78">
+  <w:footnote w:id="77">
     <w:p>
       <w:pPr>
         <w:pStyle w:val="FootnoteText"/>
@@ -10197,7 +10209,7 @@
         <w:t xml:space="preserve"> </w:t>
       </w:r>
       <w:r>
-        <w:t xml:space="preserve">Qian, S. 1</w:t>
+        <w:t xml:space="preserve">DeMiguel et al., S. 1942</w:t>
       </w:r>
     </w:p>
   </w:footnote>
@@ -10216,7 +10228,7 @@
         <w:t xml:space="preserve"> </w:t>
       </w:r>
       <w:r>
-        <w:t xml:space="preserve">Maillard et al., S. 4</w:t>
+        <w:t xml:space="preserve">Qian, S. 1</w:t>
       </w:r>
     </w:p>
   </w:footnote>
@@ -10277,7 +10289,7 @@
       </w:r>
     </w:p>
   </w:footnote>
-  <w:footnote w:id="85">
+  <w:footnote w:id="83">
     <w:p>
       <w:pPr>
         <w:pStyle w:val="FootnoteText"/>
@@ -10292,11 +10304,11 @@
         <w:t xml:space="preserve"> </w:t>
       </w:r>
       <w:r>
-        <w:t xml:space="preserve">Breiman, S. 26</w:t>
+        <w:t xml:space="preserve">Maillard et al., S. 4</w:t>
       </w:r>
     </w:p>
   </w:footnote>
-  <w:footnote w:id="87">
+  <w:footnote w:id="86">
     <w:p>
       <w:pPr>
         <w:pStyle w:val="FootnoteText"/>
@@ -10330,26 +10342,26 @@
         <w:t xml:space="preserve"> </w:t>
       </w:r>
       <w:r>
+        <w:t xml:space="preserve">Breiman, S. 26</w:t>
+      </w:r>
+    </w:p>
+  </w:footnote>
+  <w:footnote w:id="89">
+    <w:p>
+      <w:pPr>
+        <w:pStyle w:val="FootnoteText"/>
+      </w:pPr>
+      <w:r>
+        <w:rPr>
+          <w:rStyle w:val="FootnoteReference"/>
+        </w:rPr>
+        <w:footnoteRef/>
+      </w:r>
+      <w:r>
+        <w:t xml:space="preserve"> </w:t>
+      </w:r>
+      <w:r>
         <w:t xml:space="preserve">Breiman, S. 6</w:t>
-      </w:r>
-    </w:p>
-  </w:footnote>
-  <w:footnote w:id="90">
-    <w:p>
-      <w:pPr>
-        <w:pStyle w:val="FootnoteText"/>
-      </w:pPr>
-      <w:r>
-        <w:rPr>
-          <w:rStyle w:val="FootnoteReference"/>
-        </w:rPr>
-        <w:footnoteRef/>
-      </w:r>
-      <w:r>
-        <w:t xml:space="preserve"> </w:t>
-      </w:r>
-      <w:r>
-        <w:t xml:space="preserve">Breiman, S. 6 u. 26</w:t>
       </w:r>
     </w:p>
   </w:footnote>
@@ -10368,7 +10380,7 @@
         <w:t xml:space="preserve"> </w:t>
       </w:r>
       <w:r>
-        <w:t xml:space="preserve">Breiman, S. 5 f.</w:t>
+        <w:t xml:space="preserve">Breiman, S. 6 u. 26</w:t>
       </w:r>
     </w:p>
   </w:footnote>
@@ -10406,7 +10418,7 @@
         <w:t xml:space="preserve"> </w:t>
       </w:r>
       <w:r>
-        <w:t xml:space="preserve">Breiman, S. 6 u. 26</w:t>
+        <w:t xml:space="preserve">Breiman, S. 5 f.</w:t>
       </w:r>
     </w:p>
   </w:footnote>
@@ -10425,7 +10437,7 @@
         <w:t xml:space="preserve"> </w:t>
       </w:r>
       <w:r>
-        <w:t xml:space="preserve">Breiman, S. 26</w:t>
+        <w:t xml:space="preserve">Breiman, S. 6 u. 26</w:t>
       </w:r>
     </w:p>
   </w:footnote>
@@ -10444,26 +10456,26 @@
         <w:t xml:space="preserve"> </w:t>
       </w:r>
       <w:r>
+        <w:t xml:space="preserve">Breiman, S. 26</w:t>
+      </w:r>
+    </w:p>
+  </w:footnote>
+  <w:footnote w:id="96">
+    <w:p>
+      <w:pPr>
+        <w:pStyle w:val="FootnoteText"/>
+      </w:pPr>
+      <w:r>
+        <w:rPr>
+          <w:rStyle w:val="FootnoteReference"/>
+        </w:rPr>
+        <w:footnoteRef/>
+      </w:r>
+      <w:r>
+        <w:t xml:space="preserve"> </w:t>
+      </w:r>
+      <w:r>
         <w:t xml:space="preserve">Breiman, S. 27</w:t>
-      </w:r>
-    </w:p>
-  </w:footnote>
-  <w:footnote w:id="97">
-    <w:p>
-      <w:pPr>
-        <w:pStyle w:val="FootnoteText"/>
-      </w:pPr>
-      <w:r>
-        <w:rPr>
-          <w:rStyle w:val="FootnoteReference"/>
-        </w:rPr>
-        <w:footnoteRef/>
-      </w:r>
-      <w:r>
-        <w:t xml:space="preserve"> </w:t>
-      </w:r>
-      <w:r>
-        <w:t xml:space="preserve">Gu/Kelly/Xiu, PDF-S. 2</w:t>
       </w:r>
     </w:p>
   </w:footnote>
@@ -10482,7 +10494,7 @@
         <w:t xml:space="preserve"> </w:t>
       </w:r>
       <w:r>
-        <w:t xml:space="preserve">Gu/Kelly/Xiu, PDF-S. 2</w:t>
+        <w:t xml:space="preserve">Gu/Kelly/Xiu, S. 2223</w:t>
       </w:r>
     </w:p>
   </w:footnote>
@@ -10501,7 +10513,7 @@
         <w:t xml:space="preserve"> </w:t>
       </w:r>
       <w:r>
-        <w:t xml:space="preserve">Gu/Kelly/Xiu, PDF-S. 6</w:t>
+        <w:t xml:space="preserve">Gu/Kelly/Xiu, S. 2223</w:t>
       </w:r>
     </w:p>
   </w:footnote>
@@ -10520,7 +10532,7 @@
         <w:t xml:space="preserve"> </w:t>
       </w:r>
       <w:r>
-        <w:t xml:space="preserve">Gu/Kelly/Xiu, PDF-S. 6 u. 12</w:t>
+        <w:t xml:space="preserve">Gu/Kelly/Xiu, S. 2227</w:t>
       </w:r>
     </w:p>
   </w:footnote>
@@ -10539,7 +10551,7 @@
         <w:t xml:space="preserve"> </w:t>
       </w:r>
       <w:r>
-        <w:t xml:space="preserve">Gu/Kelly/Xiu, PDF-S. 3</w:t>
+        <w:t xml:space="preserve">Gu/Kelly/Xiu, S. 2234</w:t>
       </w:r>
     </w:p>
   </w:footnote>
@@ -10558,11 +10570,11 @@
         <w:t xml:space="preserve"> </w:t>
       </w:r>
       <w:r>
-        <w:t xml:space="preserve">Gu/Kelly/Xiu, PDF-S. 3 u. 12</w:t>
+        <w:t xml:space="preserve">Gu/Kelly/Xiu, S. 2228</w:t>
       </w:r>
     </w:p>
   </w:footnote>
-  <w:footnote w:id="106">
+  <w:footnote w:id="103">
     <w:p>
       <w:pPr>
         <w:pStyle w:val="FootnoteText"/>
@@ -10577,7 +10589,7 @@
         <w:t xml:space="preserve"> </w:t>
       </w:r>
       <w:r>
-        <w:t xml:space="preserve">Gu/Kelly/Xiu, PDF-S. 2</w:t>
+        <w:t xml:space="preserve">Gu/Kelly/Xiu, S. 2225</w:t>
       </w:r>
     </w:p>
   </w:footnote>
@@ -10596,26 +10608,26 @@
         <w:t xml:space="preserve"> </w:t>
       </w:r>
       <w:r>
+        <w:t xml:space="preserve">Gu/Kelly/Xiu, S. 2223</w:t>
+      </w:r>
+    </w:p>
+  </w:footnote>
+  <w:footnote w:id="108">
+    <w:p>
+      <w:pPr>
+        <w:pStyle w:val="FootnoteText"/>
+      </w:pPr>
+      <w:r>
+        <w:rPr>
+          <w:rStyle w:val="FootnoteReference"/>
+        </w:rPr>
+        <w:footnoteRef/>
+      </w:r>
+      <w:r>
+        <w:t xml:space="preserve"> </w:t>
+      </w:r>
+      <w:r>
         <w:t xml:space="preserve">Jegadeesh/Titman, S. 65</w:t>
-      </w:r>
-    </w:p>
-  </w:footnote>
-  <w:footnote w:id="114">
-    <w:p>
-      <w:pPr>
-        <w:pStyle w:val="FootnoteText"/>
-      </w:pPr>
-      <w:r>
-        <w:rPr>
-          <w:rStyle w:val="FootnoteReference"/>
-        </w:rPr>
-        <w:footnoteRef/>
-      </w:r>
-      <w:r>
-        <w:t xml:space="preserve"> </w:t>
-      </w:r>
-      <w:r>
-        <w:t xml:space="preserve">Sharpe, S. 13</w:t>
       </w:r>
     </w:p>
   </w:footnote>
@@ -10634,7 +10646,7 @@
         <w:t xml:space="preserve"> </w:t>
       </w:r>
       <w:r>
-        <w:t xml:space="preserve">Lo, S. 36</w:t>
+        <w:t xml:space="preserve">Sharpe, S. 13</w:t>
       </w:r>
     </w:p>
   </w:footnote>
@@ -10653,7 +10665,7 @@
         <w:t xml:space="preserve"> </w:t>
       </w:r>
       <w:r>
-        <w:t xml:space="preserve">Wolf 2007, PDF-S. 1</w:t>
+        <w:t xml:space="preserve">Lo, S. 36</w:t>
       </w:r>
     </w:p>
   </w:footnote>
@@ -10672,7 +10684,7 @@
         <w:t xml:space="preserve"> </w:t>
       </w:r>
       <w:r>
-        <w:t xml:space="preserve">Wolf 2007, PDF-S. 2</w:t>
+        <w:t xml:space="preserve">Ledoit/Wolf 2008, S. 850</w:t>
       </w:r>
     </w:p>
   </w:footnote>
@@ -10691,11 +10703,11 @@
         <w:t xml:space="preserve"> </w:t>
       </w:r>
       <w:r>
-        <w:t xml:space="preserve">Wolf 2007, PDF-S. 3</w:t>
+        <w:t xml:space="preserve">Ledoit/Wolf 2008, S. 850</w:t>
       </w:r>
     </w:p>
   </w:footnote>
-  <w:footnote w:id="120">
+  <w:footnote w:id="119">
     <w:p>
       <w:pPr>
         <w:pStyle w:val="FootnoteText"/>
@@ -10710,7 +10722,7 @@
         <w:t xml:space="preserve"> </w:t>
       </w:r>
       <w:r>
-        <w:t xml:space="preserve">Wolf 2007, PDF-S. 1</w:t>
+        <w:t xml:space="preserve">Ledoit/Wolf 2008, S. 851</w:t>
       </w:r>
     </w:p>
   </w:footnote>
@@ -10729,7 +10741,7 @@
         <w:t xml:space="preserve"> </w:t>
       </w:r>
       <w:r>
-        <w:t xml:space="preserve">Wolf 2007, PDF-S. 3 f.</w:t>
+        <w:t xml:space="preserve">Ledoit/Wolf 2008, S. 850</w:t>
       </w:r>
     </w:p>
   </w:footnote>
@@ -10748,7 +10760,7 @@
         <w:t xml:space="preserve"> </w:t>
       </w:r>
       <w:r>
-        <w:t xml:space="preserve">Wolf 2007, PDF-S. 4</w:t>
+        <w:t xml:space="preserve">Ledoit/Wolf 2008, S. 851 f.</w:t>
       </w:r>
     </w:p>
   </w:footnote>
@@ -10767,7 +10779,7 @@
         <w:t xml:space="preserve"> </w:t>
       </w:r>
       <w:r>
-        <w:t xml:space="preserve">Wolf 2007, PDF-S. 5</w:t>
+        <w:t xml:space="preserve">Ledoit/Wolf 2008, S. 852</w:t>
       </w:r>
     </w:p>
   </w:footnote>
@@ -10786,7 +10798,7 @@
         <w:t xml:space="preserve"> </w:t>
       </w:r>
       <w:r>
-        <w:t xml:space="preserve">Wolf 2007, PDF-S. 6</w:t>
+        <w:t xml:space="preserve">Ledoit/Wolf 2008, S. 853</w:t>
       </w:r>
     </w:p>
   </w:footnote>
@@ -10805,7 +10817,7 @@
         <w:t xml:space="preserve"> </w:t>
       </w:r>
       <w:r>
-        <w:t xml:space="preserve">Wolf 2007, PDF-S. 6</w:t>
+        <w:t xml:space="preserve">Ledoit/Wolf 2008, S. 853</w:t>
       </w:r>
     </w:p>
   </w:footnote>
@@ -10824,7 +10836,7 @@
         <w:t xml:space="preserve"> </w:t>
       </w:r>
       <w:r>
-        <w:t xml:space="preserve">Wolf 2007, PDF-S. 6 f.</w:t>
+        <w:t xml:space="preserve">Ledoit/Wolf 2008, S. 853</w:t>
       </w:r>
     </w:p>
   </w:footnote>
@@ -10843,7 +10855,7 @@
         <w:t xml:space="preserve"> </w:t>
       </w:r>
       <w:r>
-        <w:t xml:space="preserve">Politis/Romano, S. 1303</w:t>
+        <w:t xml:space="preserve">Ledoit/Wolf 2008, S. 854</w:t>
       </w:r>
     </w:p>
   </w:footnote>
@@ -10862,11 +10874,11 @@
         <w:t xml:space="preserve"> </w:t>
       </w:r>
       <w:r>
-        <w:t xml:space="preserve">Wolf 2007, PDF-S. 6</w:t>
+        <w:t xml:space="preserve">Politis/Romano, S. 1303</w:t>
       </w:r>
     </w:p>
   </w:footnote>
-  <w:footnote w:id="130">
+  <w:footnote w:id="129">
     <w:p>
       <w:pPr>
         <w:pStyle w:val="FootnoteText"/>
@@ -10881,7 +10893,7 @@
         <w:t xml:space="preserve"> </w:t>
       </w:r>
       <w:r>
-        <w:t xml:space="preserve">Harvey/Liu/Zhu, S. 5</w:t>
+        <w:t xml:space="preserve">Ledoit/Wolf 2008, S. 853</w:t>
       </w:r>
     </w:p>
   </w:footnote>
@@ -10900,7 +10912,7 @@
         <w:t xml:space="preserve"> </w:t>
       </w:r>
       <w:r>
-        <w:t xml:space="preserve">Harvey/Liu/Zhu, S. 1</w:t>
+        <w:t xml:space="preserve">Harvey/Liu/Zhu, S. 5</w:t>
       </w:r>
     </w:p>
   </w:footnote>
@@ -10919,7 +10931,7 @@
         <w:t xml:space="preserve"> </w:t>
       </w:r>
       <w:r>
-        <w:t xml:space="preserve">Harvey/Liu/Zhu, S. 9</w:t>
+        <w:t xml:space="preserve">Harvey/Liu/Zhu, S. 1</w:t>
       </w:r>
     </w:p>
   </w:footnote>
@@ -10957,7 +10969,7 @@
         <w:t xml:space="preserve"> </w:t>
       </w:r>
       <w:r>
-        <w:t xml:space="preserve">Harvey/Liu/Zhu, S. 11</w:t>
+        <w:t xml:space="preserve">Harvey/Liu/Zhu, S. 9</w:t>
       </w:r>
     </w:p>
   </w:footnote>
@@ -10976,26 +10988,26 @@
         <w:t xml:space="preserve"> </w:t>
       </w:r>
       <w:r>
+        <w:t xml:space="preserve">Harvey/Liu/Zhu, S. 11</w:t>
+      </w:r>
+    </w:p>
+  </w:footnote>
+  <w:footnote w:id="136">
+    <w:p>
+      <w:pPr>
+        <w:pStyle w:val="FootnoteText"/>
+      </w:pPr>
+      <w:r>
+        <w:rPr>
+          <w:rStyle w:val="FootnoteReference"/>
+        </w:rPr>
+        <w:footnoteRef/>
+      </w:r>
+      <w:r>
+        <w:t xml:space="preserve"> </w:t>
+      </w:r>
+      <w:r>
         <w:t xml:space="preserve">Holm, S. 65</w:t>
-      </w:r>
-    </w:p>
-  </w:footnote>
-  <w:footnote w:id="137">
-    <w:p>
-      <w:pPr>
-        <w:pStyle w:val="FootnoteText"/>
-      </w:pPr>
-      <w:r>
-        <w:rPr>
-          <w:rStyle w:val="FootnoteReference"/>
-        </w:rPr>
-        <w:footnoteRef/>
-      </w:r>
-      <w:r>
-        <w:t xml:space="preserve"> </w:t>
-      </w:r>
-      <w:r>
-        <w:t xml:space="preserve">Bailey/López de Prado, S. 2 u. 6</w:t>
       </w:r>
     </w:p>
   </w:footnote>
@@ -11014,7 +11026,7 @@
         <w:t xml:space="preserve"> </w:t>
       </w:r>
       <w:r>
-        <w:t xml:space="preserve">Bailey et al., S. 1 u. 4</w:t>
+        <w:t xml:space="preserve">Bailey/López de Prado, S. 2 u. 6</w:t>
       </w:r>
     </w:p>
   </w:footnote>
@@ -11033,7 +11045,7 @@
         <w:t xml:space="preserve"> </w:t>
       </w:r>
       <w:r>
-        <w:t xml:space="preserve">Bailey/López de Prado, S. 7</w:t>
+        <w:t xml:space="preserve">Bailey et al., S. 1 u. 4</w:t>
       </w:r>
     </w:p>
   </w:footnote>
@@ -11052,7 +11064,7 @@
         <w:t xml:space="preserve"> </w:t>
       </w:r>
       <w:r>
-        <w:t xml:space="preserve">Bailey/López de Prado, S. 8</w:t>
+        <w:t xml:space="preserve">Bailey/López de Prado, S. 7</w:t>
       </w:r>
     </w:p>
   </w:footnote>
@@ -11071,7 +11083,7 @@
         <w:t xml:space="preserve"> </w:t>
       </w:r>
       <w:r>
-        <w:t xml:space="preserve">Bailey/López de Prado, S. 2</w:t>
+        <w:t xml:space="preserve">Bailey/López de Prado, S. 8</w:t>
       </w:r>
     </w:p>
   </w:footnote>
@@ -11090,7 +11102,7 @@
         <w:t xml:space="preserve"> </w:t>
       </w:r>
       <w:r>
-        <w:t xml:space="preserve">Bailey/López de Prado, S. 7 f.</w:t>
+        <w:t xml:space="preserve">Bailey/López de Prado, S. 2</w:t>
       </w:r>
     </w:p>
   </w:footnote>
@@ -11109,7 +11121,7 @@
         <w:t xml:space="preserve"> </w:t>
       </w:r>
       <w:r>
-        <w:t xml:space="preserve">Bailey/López de Prado, S. 8</w:t>
+        <w:t xml:space="preserve">Bailey/López de Prado, S. 7 f.</w:t>
       </w:r>
     </w:p>
   </w:footnote>
@@ -11128,26 +11140,26 @@
         <w:t xml:space="preserve"> </w:t>
       </w:r>
       <w:r>
+        <w:t xml:space="preserve">Bailey/López de Prado, S. 8</w:t>
+      </w:r>
+    </w:p>
+  </w:footnote>
+  <w:footnote w:id="145">
+    <w:p>
+      <w:pPr>
+        <w:pStyle w:val="FootnoteText"/>
+      </w:pPr>
+      <w:r>
+        <w:rPr>
+          <w:rStyle w:val="FootnoteReference"/>
+        </w:rPr>
+        <w:footnoteRef/>
+      </w:r>
+      <w:r>
+        <w:t xml:space="preserve"> </w:t>
+      </w:r>
+      <w:r>
         <w:t xml:space="preserve">Bailey/López de Prado, S. 2</w:t>
-      </w:r>
-    </w:p>
-  </w:footnote>
-  <w:footnote w:id="146">
-    <w:p>
-      <w:pPr>
-        <w:pStyle w:val="FootnoteText"/>
-      </w:pPr>
-      <w:r>
-        <w:rPr>
-          <w:rStyle w:val="FootnoteReference"/>
-        </w:rPr>
-        <w:footnoteRef/>
-      </w:r>
-      <w:r>
-        <w:t xml:space="preserve"> </w:t>
-      </w:r>
-      <w:r>
-        <w:t xml:space="preserve">López de Prado, S. 104</w:t>
       </w:r>
     </w:p>
   </w:footnote>
@@ -11166,7 +11178,7 @@
         <w:t xml:space="preserve"> </w:t>
       </w:r>
       <w:r>
-        <w:t xml:space="preserve">López de Prado, S. 105</w:t>
+        <w:t xml:space="preserve">López de Prado, S. 104</w:t>
       </w:r>
     </w:p>
   </w:footnote>
@@ -11223,11 +11235,30 @@
         <w:t xml:space="preserve"> </w:t>
       </w:r>
       <w:r>
+        <w:t xml:space="preserve">López de Prado, S. 105</w:t>
+      </w:r>
+    </w:p>
+  </w:footnote>
+  <w:footnote w:id="151">
+    <w:p>
+      <w:pPr>
+        <w:pStyle w:val="FootnoteText"/>
+      </w:pPr>
+      <w:r>
+        <w:rPr>
+          <w:rStyle w:val="FootnoteReference"/>
+        </w:rPr>
+        <w:footnoteRef/>
+      </w:r>
+      <w:r>
+        <w:t xml:space="preserve"> </w:t>
+      </w:r>
+      <w:r>
         <w:t xml:space="preserve">López de Prado, S. 107</w:t>
       </w:r>
     </w:p>
   </w:footnote>
-  <w:footnote w:id="161">
+  <w:footnote w:id="162">
     <w:p>
       <w:pPr>
         <w:pStyle w:val="FootnoteText"/>
@@ -11246,7 +11277,7 @@
       </w:r>
     </w:p>
   </w:footnote>
-  <w:footnote w:id="163">
+  <w:footnote w:id="164">
     <w:p>
       <w:pPr>
         <w:pStyle w:val="FootnoteText"/>

</xml_diff>

<commit_message>
Abbildungen, Zusatzbelege & Roadmap-Umsetzung
- 3 Abbildungen eingebunden (Feature-Importance §4.2, kumulierte Renditen §7.1,
  rollierender Sharpe §7.2); build_docx.py: --resource-path fuer Bild-Einbettung
- Ergebniszahlen gegen output1.6/ verifiziert (keine Korrektur noetig)
- Neue Direktbelege: Black/Litterman 1992 (§2.9, §9.2), Ledoit/Wolf 2017 (§9.2);
  Literaturverzeichnis -> 26 Quellen, 117 Fussnoten
- Limitation "nur 15 Titel" in §8.3 ergaenzt
- ROADMAP.md mit Rest-To-dos + KI-Offenlegungs-Entwurf; STATUS.md aktualisiert

Co-Authored-By: Claude Opus 4.8 <noreply@anthropic.com>
</commit_message>
<xml_diff>
--- a/arbeit/W-Seminararbeit.docx
+++ b/arbeit/W-Seminararbeit.docx
@@ -442,7 +442,7 @@
     </w:p>
     <w:bookmarkEnd w:id="14"/>
     <w:bookmarkEnd w:id="15"/>
-    <w:bookmarkStart w:id="85" w:name="X755ea9fba24d7bd83bac3177d33a2b4bdfbef71"/>
+    <w:bookmarkStart w:id="86" w:name="X755ea9fba24d7bd83bac3177d33a2b4bdfbef71"/>
     <w:p>
       <w:pPr>
         <w:pStyle w:val="Heading1"/>
@@ -4244,7 +4244,7 @@
       </w:r>
     </w:p>
     <w:bookmarkEnd w:id="71"/>
-    <w:bookmarkStart w:id="78" w:name="die-naive-1n-strategie-als-maßstab"/>
+    <w:bookmarkStart w:id="79" w:name="die-naive-1n-strategie-als-maßstab"/>
     <w:p>
       <w:pPr>
         <w:pStyle w:val="Heading2"/>
@@ -4284,7 +4284,7 @@
         <w:t xml:space="preserve"> </w:t>
       </w:r>
       <w:r>
-        <w:t xml:space="preserve">Schon in der Einleitung halten DeMiguel, Garlappi und Uppal fest, dass mit klassischen ökonometrischen Punktschätzern gebildete Portfolios extreme, über die Zeit stark schwankende Gewichte aufweisen, und ordnen die Gegenmittel ein – Bayes-Shrinkage, Black-Litterman sowie Gewichtsbeschränkungen, die nach Jagannathan und Ma als Shrinkage der extremen Kovarianzelemente zu deuten sind.</w:t>
+        <w:t xml:space="preserve">Schon in der Einleitung halten DeMiguel, Garlappi und Uppal fest, dass mit klassischen ökonometrischen Punktschätzern gebildete Portfolios extreme, über die Zeit stark schwankende Gewichte aufweisen, und ordnen die Gegenmittel ein – Bayes-Shrinkage, Black-Litterman</w:t>
       </w:r>
       <w:r>
         <w:rPr>
@@ -4296,13 +4296,25 @@
         <w:t xml:space="preserve"> </w:t>
       </w:r>
       <w:r>
+        <w:t xml:space="preserve">sowie Gewichtsbeschränkungen, die nach Jagannathan und Ma als Shrinkage der extremen Kovarianzelemente zu deuten sind.</w:t>
+      </w:r>
+      <w:r>
+        <w:rPr>
+          <w:rStyle w:val="FootnoteReference"/>
+        </w:rPr>
+        <w:footnoteReference w:id="74"/>
+      </w:r>
+      <w:r>
+        <w:t xml:space="preserve"> </w:t>
+      </w:r>
+      <w:r>
         <w:t xml:space="preserve">Ihr zentrales Ergebnis lautet, dass keines der vierzehn untersuchten Optimierungsmodelle die 1/N-Regel über sieben Datensätze hinweg konsistent schlägt – weder bei der Sharpe Ratio noch beim Sicherheitsäquivalent (CEQ) oder beim Umschlag (Turnover).</w:t>
       </w:r>
       <w:r>
         <w:rPr>
           <w:rStyle w:val="FootnoteReference"/>
         </w:rPr>
-        <w:footnoteReference w:id="74"/>
+        <w:footnoteReference w:id="75"/>
       </w:r>
       <w:r>
         <w:t xml:space="preserve"> </w:t>
@@ -4346,7 +4358,7 @@
         <w:rPr>
           <w:rStyle w:val="FootnoteReference"/>
         </w:rPr>
-        <w:footnoteReference w:id="75"/>
+        <w:footnoteReference w:id="76"/>
       </w:r>
       <w:r>
         <w:t xml:space="preserve"> </w:t>
@@ -4358,7 +4370,7 @@
         <w:rPr>
           <w:rStyle w:val="FootnoteReference"/>
         </w:rPr>
-        <w:footnoteReference w:id="76"/>
+        <w:footnoteReference w:id="77"/>
       </w:r>
       <w:r>
         <w:t xml:space="preserve"> </w:t>
@@ -4370,7 +4382,7 @@
         <w:rPr>
           <w:rStyle w:val="FootnoteReference"/>
         </w:rPr>
-        <w:footnoteReference w:id="77"/>
+        <w:footnoteReference w:id="78"/>
       </w:r>
       <w:r>
         <w:t xml:space="preserve"> </w:t>
@@ -4379,8 +4391,8 @@
         <w:t xml:space="preserve">Die 1/N-Strategie ist somit kein bloßer Strohmann, sondern ein anspruchsvoller Maßstab – und genau in dieser Funktion dient sie auch in der vorliegenden Arbeit als Benchmark (Equal Weight).</w:t>
       </w:r>
     </w:p>
-    <w:bookmarkEnd w:id="78"/>
-    <w:bookmarkStart w:id="84" w:name="Xd2851ae61e417e64abc3e853315fa3af0eef789"/>
+    <w:bookmarkEnd w:id="79"/>
+    <w:bookmarkStart w:id="85" w:name="Xd2851ae61e417e64abc3e853315fa3af0eef789"/>
     <w:p>
       <w:pPr>
         <w:pStyle w:val="Heading2"/>
@@ -4448,7 +4460,7 @@
         <w:rPr>
           <w:rStyle w:val="FootnoteReference"/>
         </w:rPr>
-        <w:footnoteReference w:id="79"/>
+        <w:footnoteReference w:id="80"/>
       </w:r>
       <w:r>
         <w:t xml:space="preserve"> </w:t>
@@ -4460,7 +4472,7 @@
         <w:rPr>
           <w:rStyle w:val="FootnoteReference"/>
         </w:rPr>
-        <w:footnoteReference w:id="80"/>
+        <w:footnoteReference w:id="81"/>
       </w:r>
     </w:p>
     <w:p>
@@ -4846,7 +4858,7 @@
         <w:rPr>
           <w:rStyle w:val="FootnoteReference"/>
         </w:rPr>
-        <w:footnoteReference w:id="81"/>
+        <w:footnoteReference w:id="82"/>
       </w:r>
       <w:r>
         <w:t xml:space="preserve"> </w:t>
@@ -4986,7 +4998,7 @@
         <w:rPr>
           <w:rStyle w:val="FootnoteReference"/>
         </w:rPr>
-        <w:footnoteReference w:id="82"/>
+        <w:footnoteReference w:id="83"/>
       </w:r>
       <w:r>
         <w:t xml:space="preserve">:</w:t>
@@ -5361,7 +5373,7 @@
         <w:rPr>
           <w:rStyle w:val="FootnoteReference"/>
         </w:rPr>
-        <w:footnoteReference w:id="83"/>
+        <w:footnoteReference w:id="84"/>
       </w:r>
       <w:r>
         <w:t xml:space="preserve"> </w:t>
@@ -5370,9 +5382,9 @@
         <w:t xml:space="preserve">Anders als die 1/N-Regel berücksichtigt Risk Parity damit Volatilitäten und Korrelationen, anders als die Markowitz-Optimierung vermeidet es jedoch die fehleranfällige Renditeschätzung gänzlich. Die vorliegende Arbeit führt Risk Parity als zusätzliche, rein risikobasierte Vergleichsstrategie.</w:t>
       </w:r>
     </w:p>
-    <w:bookmarkEnd w:id="84"/>
     <w:bookmarkEnd w:id="85"/>
-    <w:bookmarkStart w:id="105" w:name="random-forest-gestützte-renditeprognose"/>
+    <w:bookmarkEnd w:id="86"/>
+    <w:bookmarkStart w:id="106" w:name="random-forest-gestützte-renditeprognose"/>
     <w:p>
       <w:pPr>
         <w:pStyle w:val="Heading1"/>
@@ -5381,7 +5393,7 @@
         <w:t xml:space="preserve">3 Random-Forest-gestützte Renditeprognose</w:t>
       </w:r>
     </w:p>
-    <w:bookmarkStart w:id="87" w:name="X0e9b36f9e64c501aa39a42e25ac51a14c97dc68"/>
+    <w:bookmarkStart w:id="88" w:name="X0e9b36f9e64c501aa39a42e25ac51a14c97dc68"/>
     <w:p>
       <w:pPr>
         <w:pStyle w:val="Heading2"/>
@@ -5562,7 +5574,7 @@
         <w:rPr>
           <w:rStyle w:val="FootnoteReference"/>
         </w:rPr>
-        <w:footnoteReference w:id="86"/>
+        <w:footnoteReference w:id="87"/>
       </w:r>
       <w:r>
         <w:t xml:space="preserve"> </w:t>
@@ -5584,8 +5596,8 @@
         <w:t xml:space="preserve">: Ein Modell, das die Trainingsdaten zu genau nachbildet, lernt deren Zufallsrauschen mit und sagt neue Daten schlecht vorher (Überanpassung). Genau dieses Problem adressiert der Random Forest auf konstruktive Weise.</w:t>
       </w:r>
     </w:p>
-    <w:bookmarkEnd w:id="87"/>
-    <w:bookmarkStart w:id="90" w:name="entscheidungsbäume-als-bausteine"/>
+    <w:bookmarkEnd w:id="88"/>
+    <w:bookmarkStart w:id="91" w:name="entscheidungsbäume-als-bausteine"/>
     <w:p>
       <w:pPr>
         <w:pStyle w:val="Heading2"/>
@@ -5615,7 +5627,7 @@
         <w:rPr>
           <w:rStyle w:val="FootnoteReference"/>
         </w:rPr>
-        <w:footnoteReference w:id="88"/>
+        <w:footnoteReference w:id="89"/>
       </w:r>
       <w:r>
         <w:t xml:space="preserve"> </w:t>
@@ -5627,7 +5639,7 @@
         <w:rPr>
           <w:rStyle w:val="FootnoteReference"/>
         </w:rPr>
-        <w:footnoteReference w:id="89"/>
+        <w:footnoteReference w:id="90"/>
       </w:r>
       <w:r>
         <w:t xml:space="preserve"> </w:t>
@@ -5636,8 +5648,8 @@
         <w:t xml:space="preserve">Erst die Kombination vieler Bäume macht das Verfahren leistungsfähig.</w:t>
       </w:r>
     </w:p>
-    <w:bookmarkEnd w:id="90"/>
-    <w:bookmarkStart w:id="97" w:name="Xa3aecce1af409174a88ace5cb9e880da6bb7e3a"/>
+    <w:bookmarkEnd w:id="91"/>
+    <w:bookmarkStart w:id="98" w:name="Xa3aecce1af409174a88ace5cb9e880da6bb7e3a"/>
     <w:p>
       <w:pPr>
         <w:pStyle w:val="Heading2"/>
@@ -5742,7 +5754,7 @@
         <w:rPr>
           <w:rStyle w:val="FootnoteReference"/>
         </w:rPr>
-        <w:footnoteReference w:id="91"/>
+        <w:footnoteReference w:id="92"/>
       </w:r>
       <w:r>
         <w:t xml:space="preserve"> </w:t>
@@ -5793,7 +5805,7 @@
         <w:rPr>
           <w:rStyle w:val="FootnoteReference"/>
         </w:rPr>
-        <w:footnoteReference w:id="92"/>
+        <w:footnoteReference w:id="93"/>
       </w:r>
       <w:r>
         <w:t xml:space="preserve"> </w:t>
@@ -5818,7 +5830,7 @@
         <w:rPr>
           <w:rStyle w:val="FootnoteReference"/>
         </w:rPr>
-        <w:footnoteReference w:id="93"/>
+        <w:footnoteReference w:id="94"/>
       </w:r>
     </w:p>
     <w:p>
@@ -5832,7 +5844,7 @@
         <w:rPr>
           <w:rStyle w:val="FootnoteReference"/>
         </w:rPr>
-        <w:footnoteReference w:id="94"/>
+        <w:footnoteReference w:id="95"/>
       </w:r>
       <w:r>
         <w:t xml:space="preserve"> </w:t>
@@ -5966,7 +5978,7 @@
         <w:rPr>
           <w:rStyle w:val="FootnoteReference"/>
         </w:rPr>
-        <w:footnoteReference w:id="95"/>
+        <w:footnoteReference w:id="96"/>
       </w:r>
       <w:r>
         <w:t xml:space="preserve"> </w:t>
@@ -6010,7 +6022,7 @@
         <w:rPr>
           <w:rStyle w:val="FootnoteReference"/>
         </w:rPr>
-        <w:footnoteReference w:id="96"/>
+        <w:footnoteReference w:id="97"/>
       </w:r>
       <w:r>
         <w:t xml:space="preserve"> </w:t>
@@ -6040,8 +6052,8 @@
         <w:t xml:space="preserve">– er stabilisiert die instabile Einzelprognose, ohne in Überanpassung zu verfallen. Eben diese Eigenschaft macht ihn zu einem Kandidaten für die stark verrauschte Aufgabe der Renditeprognose (Abschnitt 3.4).</w:t>
       </w:r>
     </w:p>
-    <w:bookmarkEnd w:id="97"/>
-    <w:bookmarkStart w:id="104" w:name="X726823064c99e540c40bd3ffa34a3d44b732c78"/>
+    <w:bookmarkEnd w:id="98"/>
+    <w:bookmarkStart w:id="105" w:name="X726823064c99e540c40bd3ffa34a3d44b732c78"/>
     <w:p>
       <w:pPr>
         <w:pStyle w:val="Heading2"/>
@@ -6061,7 +6073,7 @@
         <w:rPr>
           <w:rStyle w:val="FootnoteReference"/>
         </w:rPr>
-        <w:footnoteReference w:id="98"/>
+        <w:footnoteReference w:id="99"/>
       </w:r>
       <w:r>
         <w:t xml:space="preserve"> </w:t>
@@ -6073,7 +6085,7 @@
         <w:rPr>
           <w:rStyle w:val="FootnoteReference"/>
         </w:rPr>
-        <w:footnoteReference w:id="99"/>
+        <w:footnoteReference w:id="100"/>
       </w:r>
       <w:r>
         <w:t xml:space="preserve"> </w:t>
@@ -6110,7 +6122,7 @@
         <w:rPr>
           <w:rStyle w:val="FootnoteReference"/>
         </w:rPr>
-        <w:footnoteReference w:id="100"/>
+        <w:footnoteReference w:id="101"/>
       </w:r>
       <w:r>
         <w:t xml:space="preserve"> </w:t>
@@ -6122,7 +6134,7 @@
         <w:rPr>
           <w:rStyle w:val="FootnoteReference"/>
         </w:rPr>
-        <w:footnoteReference w:id="101"/>
+        <w:footnoteReference w:id="102"/>
       </w:r>
       <w:r>
         <w:t xml:space="preserve"> </w:t>
@@ -6134,7 +6146,7 @@
         <w:rPr>
           <w:rStyle w:val="FootnoteReference"/>
         </w:rPr>
-        <w:footnoteReference w:id="102"/>
+        <w:footnoteReference w:id="103"/>
       </w:r>
       <w:r>
         <w:t xml:space="preserve"> </w:t>
@@ -6146,7 +6158,7 @@
         <w:rPr>
           <w:rStyle w:val="FootnoteReference"/>
         </w:rPr>
-        <w:footnoteReference w:id="103"/>
+        <w:footnoteReference w:id="104"/>
       </w:r>
     </w:p>
     <w:p>
@@ -6157,9 +6169,9 @@
         <w:t xml:space="preserve">Für die vorliegende Arbeit ergeben sich daraus klare Erwartungen: Der Random Forest kann die Renditeschätzung allenfalls geringfügig verbessern, und sein Mehrwert ist keineswegs garantiert, sondern muss – gerade angesichts der Überanpassungsgefahr – sorgfältig gegen die einfacheren Strategien und gegen den Zufall geprüft werden (Kapitel 5).</w:t>
       </w:r>
     </w:p>
-    <w:bookmarkEnd w:id="104"/>
     <w:bookmarkEnd w:id="105"/>
-    <w:bookmarkStart w:id="114" w:name="methodik-des-empirischen-vergleichs"/>
+    <w:bookmarkEnd w:id="106"/>
+    <w:bookmarkStart w:id="118" w:name="methodik-des-empirischen-vergleichs"/>
     <w:p>
       <w:pPr>
         <w:pStyle w:val="Heading1"/>
@@ -6168,7 +6180,7 @@
         <w:t xml:space="preserve">4 Methodik des empirischen Vergleichs</w:t>
       </w:r>
     </w:p>
-    <w:bookmarkStart w:id="106" w:name="datengrundlage-und-untersuchungsdesign"/>
+    <w:bookmarkStart w:id="107" w:name="datengrundlage-und-untersuchungsdesign"/>
     <w:p>
       <w:pPr>
         <w:pStyle w:val="Heading2"/>
@@ -6275,8 +6287,8 @@
         <w:t xml:space="preserve">. Diese Wahl ist bewusst: Nur bei einfachen Renditen ist die Portfoliorendite exakt die gewichtete Summe der Einzelrenditen (vgl. Abschnitt 2.3) – eine Eigenschaft, die logarithmische Renditen über mehrere Anlagen hinweg nicht besitzen. Da das Universum ausschließlich aus heute noch existierenden Titeln besteht, unterliegt die Untersuchung einem Survivorship Bias, der in Kapitel 8 ausführlich gewürdigt wird.</w:t>
       </w:r>
     </w:p>
-    <w:bookmarkEnd w:id="106"/>
-    <w:bookmarkStart w:id="109" w:name="merkmalsbildung-feature-engineering"/>
+    <w:bookmarkEnd w:id="107"/>
+    <w:bookmarkStart w:id="113" w:name="merkmalsbildung-feature-engineering"/>
     <w:p>
       <w:pPr>
         <w:pStyle w:val="Heading2"/>
@@ -6312,7 +6324,7 @@
         <w:rPr>
           <w:rStyle w:val="FootnoteReference"/>
         </w:rPr>
-        <w:footnoteReference w:id="107"/>
+        <w:footnoteReference w:id="108"/>
       </w:r>
       <w:r>
         <w:t xml:space="preserve"> </w:t>
@@ -6324,17 +6336,72 @@
         <w:rPr>
           <w:rStyle w:val="FootnoteReference"/>
         </w:rPr>
-        <w:footnoteReference w:id="108"/>
-      </w:r>
-      <w:r>
-        <w:t xml:space="preserve"> </w:t>
-      </w:r>
-      <w:r>
-        <w:t xml:space="preserve">Die konkreten Berechnungsformeln der übrigen Indikatoren (RSI, MACD, Bollinger-Bänder) folgen der etablierten technischen Analyse und werden hier nicht im Einzelnen hergeleitet.</w:t>
-      </w:r>
-    </w:p>
-    <w:bookmarkEnd w:id="109"/>
-    <w:bookmarkStart w:id="110" w:name="Xd1064583cdbb989eaeca054847607609a27e3b5"/>
+        <w:footnoteReference w:id="109"/>
+      </w:r>
+      <w:r>
+        <w:t xml:space="preserve"> </w:t>
+      </w:r>
+      <w:r>
+        <w:t xml:space="preserve">Die konkreten Berechnungsformeln der übrigen Indikatoren (RSI, MACD, Bollinger-Bänder) folgen der etablierten technischen Analyse und werden hier nicht im Einzelnen hergeleitet. Die im Backtest ermittelte Bedeutung der Merkmale (Feature-Importance) bestätigt diese literaturgestützte Auswahl: Die einflussreichsten Prädiktoren des Random Forest sind durchweg Momentum- und Volatilitätsvarianten (Abbildung 1).</w:t>
+      </w:r>
+    </w:p>
+    <w:p>
+      <w:pPr>
+        <w:pStyle w:val="CaptionedFigure"/>
+      </w:pPr>
+      <w:r>
+        <w:drawing>
+          <wp:inline>
+            <wp:extent cx="4319999" cy="3816486"/>
+            <wp:effectExtent b="0" l="0" r="0" t="0"/>
+            <wp:docPr descr="Abbildung 1: Feature-Importance des Random Forest (mittlere Verringerung der Knoten-Unreinheit, letzter Trainingsschritt). Die einflussreichsten Prädiktoren sind Momentum- und Volatilitätsmerkmale – im Einklang mit der literaturgestützten Merkmalswahl." title="" id="111" name="Picture"/>
+            <a:graphic>
+              <a:graphicData uri="http://schemas.openxmlformats.org/drawingml/2006/picture">
+                <pic:pic>
+                  <pic:nvPicPr>
+                    <pic:cNvPr descr="output1.6/07_feature_importance.png" id="112" name="Picture"/>
+                    <pic:cNvPicPr>
+                      <a:picLocks noChangeArrowheads="1" noChangeAspect="1"/>
+                    </pic:cNvPicPr>
+                  </pic:nvPicPr>
+                  <pic:blipFill>
+                    <a:blip r:embed="rId110"/>
+                    <a:stretch>
+                      <a:fillRect/>
+                    </a:stretch>
+                  </pic:blipFill>
+                  <pic:spPr bwMode="auto">
+                    <a:xfrm>
+                      <a:off x="0" y="0"/>
+                      <a:ext cx="4319999" cy="3816486"/>
+                    </a:xfrm>
+                    <a:prstGeom prst="rect">
+                      <a:avLst/>
+                    </a:prstGeom>
+                    <a:noFill/>
+                    <a:ln w="9525">
+                      <a:noFill/>
+                      <a:headEnd/>
+                      <a:tailEnd/>
+                    </a:ln>
+                  </pic:spPr>
+                </pic:pic>
+              </a:graphicData>
+            </a:graphic>
+          </wp:inline>
+        </w:drawing>
+      </w:r>
+    </w:p>
+    <w:p>
+      <w:pPr>
+        <w:pStyle w:val="ImageCaption"/>
+      </w:pPr>
+      <w:r>
+        <w:t xml:space="preserve">Abbildung 1: Feature-Importance des Random Forest (mittlere Verringerung der Knoten-Unreinheit, letzter Trainingsschritt). Die einflussreichsten Prädiktoren sind Momentum- und Volatilitätsmerkmale – im Einklang mit der literaturgestützten Merkmalswahl.</w:t>
+      </w:r>
+    </w:p>
+    <w:bookmarkEnd w:id="113"/>
+    <w:bookmarkStart w:id="114" w:name="Xd1064583cdbb989eaeca054847607609a27e3b5"/>
     <w:p>
       <w:pPr>
         <w:pStyle w:val="Heading2"/>
@@ -6383,8 +6450,8 @@
         <w:t xml:space="preserve">– die unbeabsichtigte Verwendung von Zukunftsinformation. Die Untersuchung begegnet ihm auf zwei Ebenen: Die Gewichte eines Monats nutzen nur Daten bis zum vorangehenden Monatsende, und für den Random Forest wird zusätzlich der letzte Trainingsmonat ausgeschlossen, weil dessen Prognoseziel – die Rendite des Folgemonats – sonst in die Halteperiode hineinreichen würde.</w:t>
       </w:r>
     </w:p>
-    <w:bookmarkEnd w:id="110"/>
-    <w:bookmarkStart w:id="111" w:name="transaktionskosten-und-umschlag"/>
+    <w:bookmarkEnd w:id="114"/>
+    <w:bookmarkStart w:id="115" w:name="transaktionskosten-und-umschlag"/>
     <w:p>
       <w:pPr>
         <w:pStyle w:val="Heading2"/>
@@ -6533,8 +6600,8 @@
         <w:t xml:space="preserve">berechnet: Die alten Gewichte werden zunächst um die Kursdrift der Halteperiode angepasst, bevor sie mit den neuen Zielgewichten verglichen werden. Der pauschale Kostensatz ist eine Vereinfachung, die Geld-Brief-Spannen und Markteinfluss vernachlässigt; diese Limitation wird in Kapitel 8 erörtert.</w:t>
       </w:r>
     </w:p>
-    <w:bookmarkEnd w:id="111"/>
-    <w:bookmarkStart w:id="112" w:name="performance-kennzahlen"/>
+    <w:bookmarkEnd w:id="115"/>
+    <w:bookmarkStart w:id="116" w:name="performance-kennzahlen"/>
     <w:p>
       <w:pPr>
         <w:pStyle w:val="Heading2"/>
@@ -6551,8 +6618,8 @@
         <w:t xml:space="preserve">Die Strategien werden anhand mehrerer risikoadjustierter Kennzahlen beurteilt. Die zentrale Größe ist die Sharpe Ratio (Abschnitt 2.5). Ergänzend dienen die durchschnittliche jährliche Wachstumsrate (CAGR), die annualisierte Volatilität, die Sortino Ratio – die im Unterschied zur Sharpe Ratio nur die Abwärtsschwankungen ins Verhältnis setzt –, der maximale Drawdown (der größte zwischenzeitliche Verlust vom Hoch zum Tief) sowie die Calmar Ratio (CAGR im Verhältnis zum maximalen Drawdown). Durchgängig wird ein risikofreier Zins von 4 % p. a. unterstellt; die Annahme eines konstanten Satzes über den gesamten Zeitraum ist eine Vereinfachung (Kapitel 8).</w:t>
       </w:r>
     </w:p>
-    <w:bookmarkEnd w:id="112"/>
-    <w:bookmarkStart w:id="113" w:name="die-vier-verglichenen-strategien"/>
+    <w:bookmarkEnd w:id="116"/>
+    <w:bookmarkStart w:id="117" w:name="die-vier-verglichenen-strategien"/>
     <w:p>
       <w:pPr>
         <w:pStyle w:val="Heading2"/>
@@ -6633,9 +6700,9 @@
         <w:t xml:space="preserve">schließlich gewichtet so, dass jede Anlage denselben Beitrag zum Gesamtrisiko leistet (Abschnitt 2.10), und dient als zusätzliche, rein risikobasierte Vergleichsstrategie.</w:t>
       </w:r>
     </w:p>
-    <w:bookmarkEnd w:id="113"/>
-    <w:bookmarkEnd w:id="114"/>
-    <w:bookmarkStart w:id="153" w:name="statistische-signifikanz-und-robustheit"/>
+    <w:bookmarkEnd w:id="117"/>
+    <w:bookmarkEnd w:id="118"/>
+    <w:bookmarkStart w:id="157" w:name="statistische-signifikanz-und-robustheit"/>
     <w:p>
       <w:pPr>
         <w:pStyle w:val="Heading1"/>
@@ -6644,7 +6711,7 @@
         <w:t xml:space="preserve">5 Statistische Signifikanz und Robustheit</w:t>
       </w:r>
     </w:p>
-    <w:bookmarkStart w:id="120" w:name="das-grundproblem-zufall-oder-können"/>
+    <w:bookmarkStart w:id="124" w:name="das-grundproblem-zufall-oder-können"/>
     <w:p>
       <w:pPr>
         <w:pStyle w:val="Heading2"/>
@@ -6664,7 +6731,7 @@
         <w:rPr>
           <w:rStyle w:val="FootnoteReference"/>
         </w:rPr>
-        <w:footnoteReference w:id="115"/>
+        <w:footnoteReference w:id="119"/>
       </w:r>
       <w:r>
         <w:t xml:space="preserve"> </w:t>
@@ -6676,7 +6743,7 @@
         <w:rPr>
           <w:rStyle w:val="FootnoteReference"/>
         </w:rPr>
-        <w:footnoteReference w:id="116"/>
+        <w:footnoteReference w:id="120"/>
       </w:r>
       <w:r>
         <w:t xml:space="preserve"> </w:t>
@@ -6728,7 +6795,7 @@
         <w:rPr>
           <w:rStyle w:val="FootnoteReference"/>
         </w:rPr>
-        <w:footnoteReference w:id="117"/>
+        <w:footnoteReference w:id="121"/>
       </w:r>
       <w:r>
         <w:t xml:space="preserve"> </w:t>
@@ -6740,7 +6807,7 @@
         <w:rPr>
           <w:rStyle w:val="FootnoteReference"/>
         </w:rPr>
-        <w:footnoteReference w:id="118"/>
+        <w:footnoteReference w:id="122"/>
       </w:r>
       <w:r>
         <w:t xml:space="preserve"> </w:t>
@@ -6752,7 +6819,7 @@
         <w:rPr>
           <w:rStyle w:val="FootnoteReference"/>
         </w:rPr>
-        <w:footnoteReference w:id="119"/>
+        <w:footnoteReference w:id="123"/>
       </w:r>
       <w:r>
         <w:t xml:space="preserve"> </w:t>
@@ -6761,8 +6828,8 @@
         <w:t xml:space="preserve">Ein belastbarer Vergleich erfordert daher ein robusteres Verfahren.</w:t>
       </w:r>
     </w:p>
-    <w:bookmarkEnd w:id="120"/>
-    <w:bookmarkStart w:id="130" w:name="der-robuste-sharpe-differenz-test"/>
+    <w:bookmarkEnd w:id="124"/>
+    <w:bookmarkStart w:id="134" w:name="der-robuste-sharpe-differenz-test"/>
     <w:p>
       <w:pPr>
         <w:pStyle w:val="Heading2"/>
@@ -6838,7 +6905,7 @@
         <w:rPr>
           <w:rStyle w:val="FootnoteReference"/>
         </w:rPr>
-        <w:footnoteReference w:id="121"/>
+        <w:footnoteReference w:id="125"/>
       </w:r>
       <w:r>
         <w:t xml:space="preserve"> </w:t>
@@ -6903,7 +6970,7 @@
         <w:rPr>
           <w:rStyle w:val="FootnoteReference"/>
         </w:rPr>
-        <w:footnoteReference w:id="122"/>
+        <w:footnoteReference w:id="126"/>
       </w:r>
       <w:r>
         <w:t xml:space="preserve"> </w:t>
@@ -6915,7 +6982,7 @@
         <w:rPr>
           <w:rStyle w:val="FootnoteReference"/>
         </w:rPr>
-        <w:footnoteReference w:id="123"/>
+        <w:footnoteReference w:id="127"/>
       </w:r>
     </w:p>
     <w:p>
@@ -6929,7 +6996,7 @@
         <w:rPr>
           <w:rStyle w:val="FootnoteReference"/>
         </w:rPr>
-        <w:footnoteReference w:id="124"/>
+        <w:footnoteReference w:id="128"/>
       </w:r>
       <w:r>
         <w:t xml:space="preserve"> </w:t>
@@ -6971,7 +7038,7 @@
         <w:rPr>
           <w:rStyle w:val="FootnoteReference"/>
         </w:rPr>
-        <w:footnoteReference w:id="125"/>
+        <w:footnoteReference w:id="129"/>
       </w:r>
       <w:r>
         <w:t xml:space="preserve"> </w:t>
@@ -6983,7 +7050,7 @@
         <w:rPr>
           <w:rStyle w:val="FootnoteReference"/>
         </w:rPr>
-        <w:footnoteReference w:id="126"/>
+        <w:footnoteReference w:id="130"/>
       </w:r>
       <w:r>
         <w:t xml:space="preserve"> </w:t>
@@ -7008,7 +7075,7 @@
         <w:rPr>
           <w:rStyle w:val="FootnoteReference"/>
         </w:rPr>
-        <w:footnoteReference w:id="127"/>
+        <w:footnoteReference w:id="131"/>
       </w:r>
       <w:r>
         <w:t xml:space="preserve"> </w:t>
@@ -7020,7 +7087,7 @@
         <w:rPr>
           <w:rStyle w:val="FootnoteReference"/>
         </w:rPr>
-        <w:footnoteReference w:id="128"/>
+        <w:footnoteReference w:id="132"/>
       </w:r>
       <w:r>
         <w:t xml:space="preserve"> </w:t>
@@ -7032,7 +7099,7 @@
         <w:rPr>
           <w:rStyle w:val="FootnoteReference"/>
         </w:rPr>
-        <w:footnoteReference w:id="129"/>
+        <w:footnoteReference w:id="133"/>
       </w:r>
       <w:r>
         <w:t xml:space="preserve"> </w:t>
@@ -7041,8 +7108,8 @@
         <w:t xml:space="preserve">Genau dieser Test bildet das zentrale Signifikanzwerkzeug der vorliegenden Arbeit.</w:t>
       </w:r>
     </w:p>
-    <w:bookmarkEnd w:id="130"/>
-    <w:bookmarkStart w:id="137" w:name="das-problem-des-multiplen-testens"/>
+    <w:bookmarkEnd w:id="134"/>
+    <w:bookmarkStart w:id="141" w:name="das-problem-des-multiplen-testens"/>
     <w:p>
       <w:pPr>
         <w:pStyle w:val="Heading2"/>
@@ -7078,7 +7145,7 @@
         <w:rPr>
           <w:rStyle w:val="FootnoteReference"/>
         </w:rPr>
-        <w:footnoteReference w:id="131"/>
+        <w:footnoteReference w:id="135"/>
       </w:r>
       <w:r>
         <w:t xml:space="preserve"> </w:t>
@@ -7090,7 +7157,7 @@
         <w:rPr>
           <w:rStyle w:val="FootnoteReference"/>
         </w:rPr>
-        <w:footnoteReference w:id="132"/>
+        <w:footnoteReference w:id="136"/>
       </w:r>
     </w:p>
     <w:p>
@@ -7120,7 +7187,7 @@
         <w:rPr>
           <w:rStyle w:val="FootnoteReference"/>
         </w:rPr>
-        <w:footnoteReference w:id="133"/>
+        <w:footnoteReference w:id="137"/>
       </w:r>
       <w:r>
         <w:t xml:space="preserve"> </w:t>
@@ -7146,7 +7213,7 @@
         <w:rPr>
           <w:rStyle w:val="FootnoteReference"/>
         </w:rPr>
-        <w:footnoteReference w:id="134"/>
+        <w:footnoteReference w:id="138"/>
       </w:r>
       <w:r>
         <w:t xml:space="preserve"> </w:t>
@@ -7190,7 +7257,7 @@
         <w:rPr>
           <w:rStyle w:val="FootnoteReference"/>
         </w:rPr>
-        <w:footnoteReference w:id="135"/>
+        <w:footnoteReference w:id="139"/>
       </w:r>
       <w:r>
         <w:t xml:space="preserve"> </w:t>
@@ -7216,7 +7283,7 @@
         <w:rPr>
           <w:rStyle w:val="FootnoteReference"/>
         </w:rPr>
-        <w:footnoteReference w:id="136"/>
+        <w:footnoteReference w:id="140"/>
       </w:r>
       <w:r>
         <w:t xml:space="preserve"> </w:t>
@@ -7225,8 +7292,8 @@
         <w:t xml:space="preserve">Die vorliegende Arbeit wendet die Holm-Korrektur auf ihre fünf paarweisen Strategievergleiche an, sodass ein als signifikant ausgewiesener Unterschied auch der Korrektur für multiples Testen standhält.</w:t>
       </w:r>
     </w:p>
-    <w:bookmarkEnd w:id="137"/>
-    <w:bookmarkStart w:id="146" w:name="X4977f6fab2ab33ba270d7c6eec7285dacd7883a"/>
+    <w:bookmarkEnd w:id="141"/>
+    <w:bookmarkStart w:id="150" w:name="X4977f6fab2ab33ba270d7c6eec7285dacd7883a"/>
     <w:p>
       <w:pPr>
         <w:pStyle w:val="Heading2"/>
@@ -7278,7 +7345,7 @@
         <w:rPr>
           <w:rStyle w:val="FootnoteReference"/>
         </w:rPr>
-        <w:footnoteReference w:id="138"/>
+        <w:footnoteReference w:id="142"/>
       </w:r>
       <w:r>
         <w:t xml:space="preserve"> </w:t>
@@ -7306,7 +7373,7 @@
         <w:rPr>
           <w:rStyle w:val="FootnoteReference"/>
         </w:rPr>
-        <w:footnoteReference w:id="139"/>
+        <w:footnoteReference w:id="143"/>
       </w:r>
       <w:r>
         <w:t xml:space="preserve"> </w:t>
@@ -7318,7 +7385,7 @@
         <w:rPr>
           <w:rStyle w:val="FootnoteReference"/>
         </w:rPr>
-        <w:footnoteReference w:id="140"/>
+        <w:footnoteReference w:id="144"/>
       </w:r>
       <w:r>
         <w:t xml:space="preserve"> </w:t>
@@ -7330,7 +7397,7 @@
         <w:rPr>
           <w:rStyle w:val="FootnoteReference"/>
         </w:rPr>
-        <w:footnoteReference w:id="141"/>
+        <w:footnoteReference w:id="145"/>
       </w:r>
     </w:p>
     <w:p>
@@ -7360,7 +7427,7 @@
         <w:rPr>
           <w:rStyle w:val="FootnoteReference"/>
         </w:rPr>
-        <w:footnoteReference w:id="142"/>
+        <w:footnoteReference w:id="146"/>
       </w:r>
       <w:r>
         <w:t xml:space="preserve"> </w:t>
@@ -7402,7 +7469,7 @@
         <w:rPr>
           <w:rStyle w:val="FootnoteReference"/>
         </w:rPr>
-        <w:footnoteReference w:id="143"/>
+        <w:footnoteReference w:id="147"/>
       </w:r>
       <w:r>
         <w:t xml:space="preserve"> </w:t>
@@ -7414,7 +7481,7 @@
         <w:rPr>
           <w:rStyle w:val="FootnoteReference"/>
         </w:rPr>
-        <w:footnoteReference w:id="144"/>
+        <w:footnoteReference w:id="148"/>
       </w:r>
       <w:r>
         <w:t xml:space="preserve"> </w:t>
@@ -7426,7 +7493,7 @@
         <w:rPr>
           <w:rStyle w:val="FootnoteReference"/>
         </w:rPr>
-        <w:footnoteReference w:id="145"/>
+        <w:footnoteReference w:id="149"/>
       </w:r>
       <w:r>
         <w:t xml:space="preserve"> </w:t>
@@ -7435,8 +7502,8 @@
         <w:t xml:space="preserve">Die vorliegende Arbeit berechnet die DSR für jede der vier Strategien, um deren Sharpe Ratios gegen Selektionsverzerrung und schwere Verteilungsränder abzusichern.</w:t>
       </w:r>
     </w:p>
-    <w:bookmarkEnd w:id="146"/>
-    <w:bookmarkStart w:id="152" w:name="Xc57e80040acf2e538da00c47343d5dbd9fb962e"/>
+    <w:bookmarkEnd w:id="150"/>
+    <w:bookmarkStart w:id="156" w:name="Xc57e80040acf2e538da00c47343d5dbd9fb962e"/>
     <w:p>
       <w:pPr>
         <w:pStyle w:val="Heading2"/>
@@ -7456,7 +7523,7 @@
         <w:rPr>
           <w:rStyle w:val="FootnoteReference"/>
         </w:rPr>
-        <w:footnoteReference w:id="147"/>
+        <w:footnoteReference w:id="151"/>
       </w:r>
       <w:r>
         <w:t xml:space="preserve"> </w:t>
@@ -7578,7 +7645,7 @@
         <w:rPr>
           <w:rStyle w:val="FootnoteReference"/>
         </w:rPr>
-        <w:footnoteReference w:id="148"/>
+        <w:footnoteReference w:id="152"/>
       </w:r>
     </w:p>
     <w:p>
@@ -7608,7 +7675,7 @@
         <w:rPr>
           <w:rStyle w:val="FootnoteReference"/>
         </w:rPr>
-        <w:footnoteReference w:id="149"/>
+        <w:footnoteReference w:id="153"/>
       </w:r>
       <w:r>
         <w:t xml:space="preserve"> </w:t>
@@ -7636,7 +7703,7 @@
         <w:rPr>
           <w:rStyle w:val="FootnoteReference"/>
         </w:rPr>
-        <w:footnoteReference w:id="150"/>
+        <w:footnoteReference w:id="154"/>
       </w:r>
       <w:r>
         <w:t xml:space="preserve"> </w:t>
@@ -7718,7 +7785,7 @@
         <w:rPr>
           <w:rStyle w:val="FootnoteReference"/>
         </w:rPr>
-        <w:footnoteReference w:id="151"/>
+        <w:footnoteReference w:id="155"/>
       </w:r>
       <w:r>
         <w:t xml:space="preserve"> </w:t>
@@ -7727,9 +7794,9 @@
         <w:t xml:space="preserve">Die vorliegende Arbeit setzt dieses Verfahren als zuschaltbare Option im Hyperparameter-Tuning des Random Forest um und begegnet damit dem Informationsleck der überlappenden Monatslabels.</w:t>
       </w:r>
     </w:p>
-    <w:bookmarkEnd w:id="152"/>
-    <w:bookmarkEnd w:id="153"/>
-    <w:bookmarkStart w:id="156" w:name="implementierung"/>
+    <w:bookmarkEnd w:id="156"/>
+    <w:bookmarkEnd w:id="157"/>
+    <w:bookmarkStart w:id="160" w:name="implementierung"/>
     <w:p>
       <w:pPr>
         <w:pStyle w:val="Heading1"/>
@@ -7738,7 +7805,7 @@
         <w:t xml:space="preserve">6 Implementierung</w:t>
       </w:r>
     </w:p>
-    <w:bookmarkStart w:id="154" w:name="architektur-und-reproduzierbarkeit"/>
+    <w:bookmarkStart w:id="158" w:name="architektur-und-reproduzierbarkeit"/>
     <w:p>
       <w:pPr>
         <w:pStyle w:val="Heading2"/>
@@ -7755,8 +7822,8 @@
         <w:t xml:space="preserve">Die Untersuchung ist vollständig in Python umgesetzt. Der Code ist als modulares Paket organisiert, dessen Module den Bausteinen dieser Arbeit entsprechen: Datenbeschaffung, technische Indikatoren, die drei Optimierer (Markowitz, Risk Parity, Random Forest), die Backtest-Engine, die Kennzahlenberechnung, das Signifikanzmodul sowie die Visualisierung. Verwendet werden etablierte wissenschaftliche Bibliotheken (unter anderem NumPy, pandas, scikit-learn und SciPy). Zur Sicherung der Reproduzierbarkeit werden alle Zufallsprozesse mit festen Startwerten (Seeds) initialisiert, sämtliche Parameter in einer zentralen Konfiguration gehalten, die Ergebnisse als CSV- und JSON-Dateien protokolliert und der gesamte Entwicklungsstand unter Versionskontrolle (Git) geführt. Eine automatisierte Testsuite prüft die Kernfunktionen – etwa die Kennzahlen, die Einhaltung der Optimierer-Nebenbedingungen und den Look-Ahead-Schutz.</w:t>
       </w:r>
     </w:p>
-    <w:bookmarkEnd w:id="154"/>
-    <w:bookmarkStart w:id="155" w:name="kernkomponenten"/>
+    <w:bookmarkEnd w:id="158"/>
+    <w:bookmarkStart w:id="159" w:name="kernkomponenten"/>
     <w:p>
       <w:pPr>
         <w:pStyle w:val="Heading2"/>
@@ -7875,9 +7942,9 @@
         <w:t xml:space="preserve">(Abschnitte 2.4 und 2.8); gelöst wird mit dem SLSQP-Verfahren der Bibliothek SciPy. Der Random Forest wird zu jedem Rebalancing-Termin über eine randomisierte Hyperparametersuche mit Zeitreihen-Kreuzvalidierung trainiert (Abschnitt 5.5) und prognostiziert die Rendite des Folgemonats, die anschließend als erwartete Rendite in dieselbe Sharpe-Maximierung eingeht. Die Backtest-Engine steuert das rollierende Walk-Forward-Schema (Abschnitt 4.3), verbucht die Transaktionskosten (Abschnitt 4.4) und protokolliert Gewichte, Renditen und Umschlag jeder Periode. Das Signifikanzmodul schließlich implementiert den robusten Sharpe-Differenz-Test, die Holm-Korrektur und die Deflated Sharpe Ratio (Kapitel 5).</w:t>
       </w:r>
     </w:p>
-    <w:bookmarkEnd w:id="155"/>
-    <w:bookmarkEnd w:id="156"/>
-    <w:bookmarkStart w:id="160" w:name="ergebnisse"/>
+    <w:bookmarkEnd w:id="159"/>
+    <w:bookmarkEnd w:id="160"/>
+    <w:bookmarkStart w:id="170" w:name="ergebnisse"/>
     <w:p>
       <w:pPr>
         <w:pStyle w:val="Heading1"/>
@@ -7886,7 +7953,7 @@
         <w:t xml:space="preserve">7 Ergebnisse</w:t>
       </w:r>
     </w:p>
-    <w:bookmarkStart w:id="157" w:name="performance-der-vier-strategien"/>
+    <w:bookmarkStart w:id="164" w:name="performance-der-vier-strategien"/>
     <w:p>
       <w:pPr>
         <w:pStyle w:val="Heading2"/>
@@ -8210,11 +8277,66 @@
         <w:pStyle w:val="BodyText"/>
       </w:pPr>
       <w:r>
-        <w:t xml:space="preserve">Gemessen an den Punktschätzern rangiert der Random Forest mit einer Sharpe Ratio von 1,01 knapp vorn, gefolgt von Markowitz (0,92) und Equal Weight (0,91), die praktisch gleichauf liegen; Risk Parity bildet mit 0,79 das Schlusslicht. Bemerkenswert ist bereits hier, dass die aufwändigen Optimierungsverfahren die naive 1/N-Strategie nur geringfügig (Random Forest) bzw. kaum (Markowitz) übertreffen – ein erstes Indiz im Sinne des Befundes von DeMiguel, Garlappi und Uppal (Abschnitt 2.9).</w:t>
-      </w:r>
-    </w:p>
-    <w:bookmarkEnd w:id="157"/>
-    <w:bookmarkStart w:id="158" w:name="X00b641efc050fa26c9cbcca4f219c205baa1dc2"/>
+        <w:t xml:space="preserve">Gemessen an den Punktschätzern rangiert der Random Forest mit einer Sharpe Ratio von 1,01 knapp vorn, gefolgt von Markowitz (0,92) und Equal Weight (0,91), die praktisch gleichauf liegen; Risk Parity bildet mit 0,79 das Schlusslicht. Bemerkenswert ist bereits hier, dass die aufwändigen Optimierungsverfahren die naive 1/N-Strategie nur geringfügig (Random Forest) bzw. kaum (Markowitz) übertreffen – ein erstes Indiz im Sinne des Befundes von DeMiguel, Garlappi und Uppal (Abschnitt 2.9). Den zeitlichen Verlauf der kumulierten Wertentwicklung samt Drawdowns zeigt Abbildung 2.</w:t>
+      </w:r>
+    </w:p>
+    <w:p>
+      <w:pPr>
+        <w:pStyle w:val="CaptionedFigure"/>
+      </w:pPr>
+      <w:r>
+        <w:drawing>
+          <wp:inline>
+            <wp:extent cx="5334000" cy="3249662"/>
+            <wp:effectExtent b="0" l="0" r="0" t="0"/>
+            <wp:docPr descr="Abbildung 2: Kumulierte Wertentwicklung der vier Strategien (Startwert 1 €, 2015–2024) nach Transaktionskosten; das untere Panel zeigt den jeweiligen Drawdown-Verlauf." title="" id="162" name="Picture"/>
+            <a:graphic>
+              <a:graphicData uri="http://schemas.openxmlformats.org/drawingml/2006/picture">
+                <pic:pic>
+                  <pic:nvPicPr>
+                    <pic:cNvPr descr="output1.6/01_kumulierte_renditen.png" id="163" name="Picture"/>
+                    <pic:cNvPicPr>
+                      <a:picLocks noChangeArrowheads="1" noChangeAspect="1"/>
+                    </pic:cNvPicPr>
+                  </pic:nvPicPr>
+                  <pic:blipFill>
+                    <a:blip r:embed="rId161"/>
+                    <a:stretch>
+                      <a:fillRect/>
+                    </a:stretch>
+                  </pic:blipFill>
+                  <pic:spPr bwMode="auto">
+                    <a:xfrm>
+                      <a:off x="0" y="0"/>
+                      <a:ext cx="5334000" cy="3249662"/>
+                    </a:xfrm>
+                    <a:prstGeom prst="rect">
+                      <a:avLst/>
+                    </a:prstGeom>
+                    <a:noFill/>
+                    <a:ln w="9525">
+                      <a:noFill/>
+                      <a:headEnd/>
+                      <a:tailEnd/>
+                    </a:ln>
+                  </pic:spPr>
+                </pic:pic>
+              </a:graphicData>
+            </a:graphic>
+          </wp:inline>
+        </w:drawing>
+      </w:r>
+    </w:p>
+    <w:p>
+      <w:pPr>
+        <w:pStyle w:val="ImageCaption"/>
+      </w:pPr>
+      <w:r>
+        <w:t xml:space="preserve">Abbildung 2: Kumulierte Wertentwicklung der vier Strategien (Startwert 1 €, 2015–2024) nach Transaktionskosten; das untere Panel zeigt den jeweiligen Drawdown-Verlauf.</w:t>
+      </w:r>
+    </w:p>
+    <w:bookmarkEnd w:id="164"/>
+    <w:bookmarkStart w:id="168" w:name="X00b641efc050fa26c9cbcca4f219c205baa1dc2"/>
     <w:p>
       <w:pPr>
         <w:pStyle w:val="Heading2"/>
@@ -8495,11 +8617,66 @@
         <w:t xml:space="preserve"> </w:t>
       </w:r>
       <w:r>
-        <w:t xml:space="preserve">der aktiven Strategien die naive 1/N-Benchmark in statistisch belastbarer Weise.</w:t>
-      </w:r>
-    </w:p>
-    <w:bookmarkEnd w:id="158"/>
-    <w:bookmarkStart w:id="159" w:name="deflated-sharpe-ratio"/>
+        <w:t xml:space="preserve">der aktiven Strategien die naive 1/N-Benchmark in statistisch belastbarer Weise. Dass die Strategien über den gesamten Zeitraum eng beieinander liegen und sich ihre Rangfolge fortlaufend ändert, veranschaulicht auch der rollierende Sharpe-Verlauf (Abbildung 3).</w:t>
+      </w:r>
+    </w:p>
+    <w:p>
+      <w:pPr>
+        <w:pStyle w:val="CaptionedFigure"/>
+      </w:pPr>
+      <w:r>
+        <w:drawing>
+          <wp:inline>
+            <wp:extent cx="5334000" cy="2012673"/>
+            <wp:effectExtent b="0" l="0" r="0" t="0"/>
+            <wp:docPr descr="Abbildung 3: Rollierender Sharpe Ratio (252-Tage-Fenster) der vier Strategien. Die Kurven verlaufen über weite Strecken ineinander verschränkt – ein anschaulicher Hinweis darauf, dass keine Strategie dauerhaft dominiert." title="" id="166" name="Picture"/>
+            <a:graphic>
+              <a:graphicData uri="http://schemas.openxmlformats.org/drawingml/2006/picture">
+                <pic:pic>
+                  <pic:nvPicPr>
+                    <pic:cNvPr descr="output1.6/06_rollierender_sharpe.png" id="167" name="Picture"/>
+                    <pic:cNvPicPr>
+                      <a:picLocks noChangeArrowheads="1" noChangeAspect="1"/>
+                    </pic:cNvPicPr>
+                  </pic:nvPicPr>
+                  <pic:blipFill>
+                    <a:blip r:embed="rId165"/>
+                    <a:stretch>
+                      <a:fillRect/>
+                    </a:stretch>
+                  </pic:blipFill>
+                  <pic:spPr bwMode="auto">
+                    <a:xfrm>
+                      <a:off x="0" y="0"/>
+                      <a:ext cx="5334000" cy="2012673"/>
+                    </a:xfrm>
+                    <a:prstGeom prst="rect">
+                      <a:avLst/>
+                    </a:prstGeom>
+                    <a:noFill/>
+                    <a:ln w="9525">
+                      <a:noFill/>
+                      <a:headEnd/>
+                      <a:tailEnd/>
+                    </a:ln>
+                  </pic:spPr>
+                </pic:pic>
+              </a:graphicData>
+            </a:graphic>
+          </wp:inline>
+        </w:drawing>
+      </w:r>
+    </w:p>
+    <w:p>
+      <w:pPr>
+        <w:pStyle w:val="ImageCaption"/>
+      </w:pPr>
+      <w:r>
+        <w:t xml:space="preserve">Abbildung 3: Rollierender Sharpe Ratio (252-Tage-Fenster) der vier Strategien. Die Kurven verlaufen über weite Strecken ineinander verschränkt – ein anschaulicher Hinweis darauf, dass keine Strategie dauerhaft dominiert.</w:t>
+      </w:r>
+    </w:p>
+    <w:bookmarkEnd w:id="168"/>
+    <w:bookmarkStart w:id="169" w:name="deflated-sharpe-ratio"/>
     <w:p>
       <w:pPr>
         <w:pStyle w:val="Heading2"/>
@@ -8532,9 +8709,9 @@
         <w:t xml:space="preserve">untereinander trifft er hingegen keine Aussage.</w:t>
       </w:r>
     </w:p>
-    <w:bookmarkEnd w:id="159"/>
-    <w:bookmarkEnd w:id="160"/>
-    <w:bookmarkStart w:id="166" w:name="diskussion-und-kritische-würdigung"/>
+    <w:bookmarkEnd w:id="169"/>
+    <w:bookmarkEnd w:id="170"/>
+    <w:bookmarkStart w:id="176" w:name="diskussion-und-kritische-würdigung"/>
     <w:p>
       <w:pPr>
         <w:pStyle w:val="Heading1"/>
@@ -8543,7 +8720,7 @@
         <w:t xml:space="preserve">8 Diskussion und kritische Würdigung</w:t>
       </w:r>
     </w:p>
-    <w:bookmarkStart w:id="161" w:name="einordnung-des-kernbefunds"/>
+    <w:bookmarkStart w:id="171" w:name="einordnung-des-kernbefunds"/>
     <w:p>
       <w:pPr>
         <w:pStyle w:val="Heading2"/>
@@ -8606,8 +8783,8 @@
         <w:t xml:space="preserve">selbst der besten Verfahren nur etwa 0,4 % beträgt, ist ein robust messbarer Performancevorsprung kaum zu erwarten.</w:t>
       </w:r>
     </w:p>
-    <w:bookmarkEnd w:id="161"/>
-    <w:bookmarkStart w:id="163" w:name="survivorship-bias"/>
+    <w:bookmarkEnd w:id="171"/>
+    <w:bookmarkStart w:id="173" w:name="survivorship-bias"/>
     <w:p>
       <w:pPr>
         <w:pStyle w:val="Heading2"/>
@@ -8627,7 +8804,7 @@
         <w:rPr>
           <w:rStyle w:val="FootnoteReference"/>
         </w:rPr>
-        <w:footnoteReference w:id="162"/>
+        <w:footnoteReference w:id="172"/>
       </w:r>
       <w:r>
         <w:t xml:space="preserve"> </w:t>
@@ -8668,8 +8845,8 @@
         <w:t xml:space="preserve">zusammengesetztes Universum vermeiden, das zu jedem Zeitpunkt die tatsächlich gehandelten – einschließlich später ausgeschiedener – Titel enthält; entsprechende Daten standen für diese Arbeit jedoch nicht zur Verfügung. Die Ergebnisse sind daher als relativer Strategievergleich aussagekräftiger denn als Prognose absoluter Renditen.</w:t>
       </w:r>
     </w:p>
-    <w:bookmarkEnd w:id="163"/>
-    <w:bookmarkStart w:id="165" w:name="weitere-limitationen"/>
+    <w:bookmarkEnd w:id="173"/>
+    <w:bookmarkStart w:id="175" w:name="weitere-limitationen"/>
     <w:p>
       <w:pPr>
         <w:pStyle w:val="Heading2"/>
@@ -8689,18 +8866,18 @@
         <w:rPr>
           <w:rStyle w:val="FootnoteReference"/>
         </w:rPr>
-        <w:footnoteReference w:id="164"/>
-      </w:r>
-      <w:r>
-        <w:t xml:space="preserve"> </w:t>
-      </w:r>
-      <w:r>
-        <w:t xml:space="preserve">ein pauschaler Satz unterschätzt somit die Kosten großer Umschichtungen. Drittens beruht die Untersuchung auf einem einzigen historischen Pfad, der von einem überwiegend steigenden Markt geprägt ist; die Ergebnisse sind daher regimeabhängig. Diese Limitationen schmälern die externe Validität, ändern jedoch nichts am methodisch abgesicherten Kernbefund.</w:t>
-      </w:r>
-    </w:p>
-    <w:bookmarkEnd w:id="165"/>
-    <w:bookmarkEnd w:id="166"/>
-    <w:bookmarkStart w:id="169" w:name="fazit-und-ausblick"/>
+        <w:footnoteReference w:id="174"/>
+      </w:r>
+      <w:r>
+        <w:t xml:space="preserve"> </w:t>
+      </w:r>
+      <w:r>
+        <w:t xml:space="preserve">ein pauschaler Satz unterschätzt somit die Kosten großer Umschichtungen. Drittens beruht die Untersuchung auf einem einzigen historischen Pfad, der von einem überwiegend steigenden Markt geprägt ist; die Ergebnisse sind daher regimeabhängig. Viertens umfasst das Anlageuniversum mit nur fünfzehn Titeln einen kleinen Marktausschnitt, was sowohl die Diversifikationsmöglichkeiten als auch die Trennschärfe der statistischen Tests begrenzt. Diese Limitationen schmälern die externe Validität, ändern jedoch nichts am methodisch abgesicherten Kernbefund.</w:t>
+      </w:r>
+    </w:p>
+    <w:bookmarkEnd w:id="175"/>
+    <w:bookmarkEnd w:id="176"/>
+    <w:bookmarkStart w:id="181" w:name="fazit-und-ausblick"/>
     <w:p>
       <w:pPr>
         <w:pStyle w:val="Heading1"/>
@@ -8709,7 +8886,7 @@
         <w:t xml:space="preserve">9 Fazit und Ausblick</w:t>
       </w:r>
     </w:p>
-    <w:bookmarkStart w:id="167" w:name="beantwortung-der-forschungsfrage"/>
+    <w:bookmarkStart w:id="177" w:name="beantwortung-der-forschungsfrage"/>
     <w:p>
       <w:pPr>
         <w:pStyle w:val="Heading2"/>
@@ -8787,8 +8964,8 @@
         <w:t xml:space="preserve">: Die untersuchten Optimierungsverfahren bieten gegenüber der einfachen Gleichgewichtung keinen statistisch gesicherten Mehrwert. Dieses Ergebnis ist kein Misserfolg, sondern eine eigenständige empirische Bestätigung des Befundes von DeMiguel, Garlappi und Uppal und unterstreicht, wie wichtig die Trennung von echtem Können und Zufall in der quantitativen Finanzforschung ist.</w:t>
       </w:r>
     </w:p>
-    <w:bookmarkEnd w:id="167"/>
-    <w:bookmarkStart w:id="168" w:name="ausblick"/>
+    <w:bookmarkEnd w:id="177"/>
+    <w:bookmarkStart w:id="180" w:name="ausblick"/>
     <w:p>
       <w:pPr>
         <w:pStyle w:val="Heading2"/>
@@ -8818,12 +8995,33 @@
         <w:t xml:space="preserve"> </w:t>
       </w:r>
       <w:r>
-        <w:t xml:space="preserve">zusammengesetztes Universum verringern, das ausgeschiedene Titel einschließt. Auf der Modellseite könnten eine zeitvariable bzw. nichtlineare Kovarianzschätzung, das Black-Litterman-Modell zur Stabilisierung der erwarteten Renditen oder ein Ensemble mehrerer ML-Verfahren erprobt werden. Schließlich würde eine Auswertung über mehrere Marktphasen und zusätzliche Datensätze die Robustheit der Befunde weiter absichern.</w:t>
-      </w:r>
-    </w:p>
-    <w:bookmarkEnd w:id="168"/>
-    <w:bookmarkEnd w:id="169"/>
-    <w:bookmarkStart w:id="170" w:name="literaturverzeichnis"/>
+        <w:t xml:space="preserve">zusammengesetztes Universum verringern, das ausgeschiedene Titel einschließt. Auf der Modellseite könnten eine zeitvariable bzw. nichtlineare Kovarianzschätzung (etwa die nichtlineare Shrinkage nach Ledoit und Wolf</w:t>
+      </w:r>
+      <w:r>
+        <w:rPr>
+          <w:rStyle w:val="FootnoteReference"/>
+        </w:rPr>
+        <w:footnoteReference w:id="178"/>
+      </w:r>
+      <w:r>
+        <w:t xml:space="preserve">), das Black-Litterman-Modell zur Stabilisierung der erwarteten Renditen</w:t>
+      </w:r>
+      <w:r>
+        <w:rPr>
+          <w:rStyle w:val="FootnoteReference"/>
+        </w:rPr>
+        <w:footnoteReference w:id="179"/>
+      </w:r>
+      <w:r>
+        <w:t xml:space="preserve"> </w:t>
+      </w:r>
+      <w:r>
+        <w:t xml:space="preserve">oder ein Ensemble mehrerer ML-Verfahren erprobt werden. Schließlich würde eine Auswertung über mehrere Marktphasen und zusätzliche Datensätze die Robustheit der Befunde weiter absichern.</w:t>
+      </w:r>
+    </w:p>
+    <w:bookmarkEnd w:id="180"/>
+    <w:bookmarkEnd w:id="181"/>
+    <w:bookmarkStart w:id="182" w:name="literaturverzeichnis"/>
     <w:p>
       <w:pPr>
         <w:pStyle w:val="Heading1"/>
@@ -8877,6 +9075,14 @@
         <w:pStyle w:val="BodyText"/>
       </w:pPr>
       <w:r>
+        <w:t xml:space="preserve">Black, Fischer/Litterman, Robert: Global Portfolio Optimization, in: Financial Analysts Journal, Jg. 48, Nr. 5, 1992, S. 28–43.</w:t>
+      </w:r>
+    </w:p>
+    <w:p>
+      <w:pPr>
+        <w:pStyle w:val="BodyText"/>
+      </w:pPr>
+      <w:r>
         <w:t xml:space="preserve">Breiman, Leo: Random Forests, in: Machine Learning, Jg. 45, Nr. 1, 2001, S. 5–32.</w:t>
       </w:r>
     </w:p>
@@ -8965,6 +9171,14 @@
         <w:pStyle w:val="BodyText"/>
       </w:pPr>
       <w:r>
+        <w:t xml:space="preserve">Ledoit, Olivier/Wolf, Michael: Nonlinear Shrinkage of the Covariance Matrix for Portfolio Selection: Markowitz Meets Goldilocks, in: The Review of Financial Studies, Jg. 30, Nr. 12, 2017, S. 4349–4388.</w:t>
+      </w:r>
+    </w:p>
+    <w:p>
+      <w:pPr>
+        <w:pStyle w:val="BodyText"/>
+      </w:pPr>
+      <w:r>
         <w:t xml:space="preserve">Lo, Andrew W.: The Statistics of Sharpe Ratios, in: Financial Analysts Journal, Jg. 58, Nr. 4, 2002, S. 36–52.</w:t>
       </w:r>
     </w:p>
@@ -9032,7 +9246,7 @@
         <w:t xml:space="preserve">Sharpe, William F.: The Sharpe Ratio, in: The Journal of Portfolio Management, Jg. 21, Nr. 1, 1994, S. 49–58 (zitiert nach dem Online-Nachdruck: https://web.stanford.edu/~wfsharpe/art/sr/sr.htm, letzter Aufruf am 21.06.2026).</w:t>
       </w:r>
     </w:p>
-    <w:bookmarkEnd w:id="170"/>
+    <w:bookmarkEnd w:id="182"/>
     <w:p>
       <w:r>
         <w:br w:type="page"/>
@@ -10133,7 +10347,7 @@
         <w:t xml:space="preserve"> </w:t>
       </w:r>
       <w:r>
-        <w:t xml:space="preserve">DeMiguel et al., S. 1916</w:t>
+        <w:t xml:space="preserve">Black/Litterman, S. 28</w:t>
       </w:r>
     </w:p>
   </w:footnote>
@@ -10152,7 +10366,7 @@
         <w:t xml:space="preserve"> </w:t>
       </w:r>
       <w:r>
-        <w:t xml:space="preserve">DeMiguel et al., S. 1915</w:t>
+        <w:t xml:space="preserve">DeMiguel et al., S. 1916</w:t>
       </w:r>
     </w:p>
   </w:footnote>
@@ -10209,26 +10423,26 @@
         <w:t xml:space="preserve"> </w:t>
       </w:r>
       <w:r>
+        <w:t xml:space="preserve">DeMiguel et al., S. 1915</w:t>
+      </w:r>
+    </w:p>
+  </w:footnote>
+  <w:footnote w:id="78">
+    <w:p>
+      <w:pPr>
+        <w:pStyle w:val="FootnoteText"/>
+      </w:pPr>
+      <w:r>
+        <w:rPr>
+          <w:rStyle w:val="FootnoteReference"/>
+        </w:rPr>
+        <w:footnoteRef/>
+      </w:r>
+      <w:r>
+        <w:t xml:space="preserve"> </w:t>
+      </w:r>
+      <w:r>
         <w:t xml:space="preserve">DeMiguel et al., S. 1942</w:t>
-      </w:r>
-    </w:p>
-  </w:footnote>
-  <w:footnote w:id="79">
-    <w:p>
-      <w:pPr>
-        <w:pStyle w:val="FootnoteText"/>
-      </w:pPr>
-      <w:r>
-        <w:rPr>
-          <w:rStyle w:val="FootnoteReference"/>
-        </w:rPr>
-        <w:footnoteRef/>
-      </w:r>
-      <w:r>
-        <w:t xml:space="preserve"> </w:t>
-      </w:r>
-      <w:r>
-        <w:t xml:space="preserve">Qian, S. 1</w:t>
       </w:r>
     </w:p>
   </w:footnote>
@@ -10247,7 +10461,7 @@
         <w:t xml:space="preserve"> </w:t>
       </w:r>
       <w:r>
-        <w:t xml:space="preserve">Maillard et al., S. 4</w:t>
+        <w:t xml:space="preserve">Qian, S. 1</w:t>
       </w:r>
     </w:p>
   </w:footnote>
@@ -10308,7 +10522,7 @@
       </w:r>
     </w:p>
   </w:footnote>
-  <w:footnote w:id="86">
+  <w:footnote w:id="84">
     <w:p>
       <w:pPr>
         <w:pStyle w:val="FootnoteText"/>
@@ -10323,11 +10537,11 @@
         <w:t xml:space="preserve"> </w:t>
       </w:r>
       <w:r>
-        <w:t xml:space="preserve">Breiman, S. 26</w:t>
+        <w:t xml:space="preserve">Maillard et al., S. 4</w:t>
       </w:r>
     </w:p>
   </w:footnote>
-  <w:footnote w:id="88">
+  <w:footnote w:id="87">
     <w:p>
       <w:pPr>
         <w:pStyle w:val="FootnoteText"/>
@@ -10361,26 +10575,26 @@
         <w:t xml:space="preserve"> </w:t>
       </w:r>
       <w:r>
+        <w:t xml:space="preserve">Breiman, S. 26</w:t>
+      </w:r>
+    </w:p>
+  </w:footnote>
+  <w:footnote w:id="90">
+    <w:p>
+      <w:pPr>
+        <w:pStyle w:val="FootnoteText"/>
+      </w:pPr>
+      <w:r>
+        <w:rPr>
+          <w:rStyle w:val="FootnoteReference"/>
+        </w:rPr>
+        <w:footnoteRef/>
+      </w:r>
+      <w:r>
+        <w:t xml:space="preserve"> </w:t>
+      </w:r>
+      <w:r>
         <w:t xml:space="preserve">Breiman, S. 6</w:t>
-      </w:r>
-    </w:p>
-  </w:footnote>
-  <w:footnote w:id="91">
-    <w:p>
-      <w:pPr>
-        <w:pStyle w:val="FootnoteText"/>
-      </w:pPr>
-      <w:r>
-        <w:rPr>
-          <w:rStyle w:val="FootnoteReference"/>
-        </w:rPr>
-        <w:footnoteRef/>
-      </w:r>
-      <w:r>
-        <w:t xml:space="preserve"> </w:t>
-      </w:r>
-      <w:r>
-        <w:t xml:space="preserve">Breiman, S. 6 u. 26</w:t>
       </w:r>
     </w:p>
   </w:footnote>
@@ -10399,7 +10613,7 @@
         <w:t xml:space="preserve"> </w:t>
       </w:r>
       <w:r>
-        <w:t xml:space="preserve">Breiman, S. 5 f.</w:t>
+        <w:t xml:space="preserve">Breiman, S. 6 u. 26</w:t>
       </w:r>
     </w:p>
   </w:footnote>
@@ -10437,7 +10651,7 @@
         <w:t xml:space="preserve"> </w:t>
       </w:r>
       <w:r>
-        <w:t xml:space="preserve">Breiman, S. 6 u. 26</w:t>
+        <w:t xml:space="preserve">Breiman, S. 5 f.</w:t>
       </w:r>
     </w:p>
   </w:footnote>
@@ -10456,7 +10670,7 @@
         <w:t xml:space="preserve"> </w:t>
       </w:r>
       <w:r>
-        <w:t xml:space="preserve">Breiman, S. 26</w:t>
+        <w:t xml:space="preserve">Breiman, S. 6 u. 26</w:t>
       </w:r>
     </w:p>
   </w:footnote>
@@ -10475,26 +10689,26 @@
         <w:t xml:space="preserve"> </w:t>
       </w:r>
       <w:r>
+        <w:t xml:space="preserve">Breiman, S. 26</w:t>
+      </w:r>
+    </w:p>
+  </w:footnote>
+  <w:footnote w:id="97">
+    <w:p>
+      <w:pPr>
+        <w:pStyle w:val="FootnoteText"/>
+      </w:pPr>
+      <w:r>
+        <w:rPr>
+          <w:rStyle w:val="FootnoteReference"/>
+        </w:rPr>
+        <w:footnoteRef/>
+      </w:r>
+      <w:r>
+        <w:t xml:space="preserve"> </w:t>
+      </w:r>
+      <w:r>
         <w:t xml:space="preserve">Breiman, S. 27</w:t>
-      </w:r>
-    </w:p>
-  </w:footnote>
-  <w:footnote w:id="98">
-    <w:p>
-      <w:pPr>
-        <w:pStyle w:val="FootnoteText"/>
-      </w:pPr>
-      <w:r>
-        <w:rPr>
-          <w:rStyle w:val="FootnoteReference"/>
-        </w:rPr>
-        <w:footnoteRef/>
-      </w:r>
-      <w:r>
-        <w:t xml:space="preserve"> </w:t>
-      </w:r>
-      <w:r>
-        <w:t xml:space="preserve">Gu/Kelly/Xiu, S. 2223</w:t>
       </w:r>
     </w:p>
   </w:footnote>
@@ -10532,7 +10746,7 @@
         <w:t xml:space="preserve"> </w:t>
       </w:r>
       <w:r>
-        <w:t xml:space="preserve">Gu/Kelly/Xiu, S. 2227</w:t>
+        <w:t xml:space="preserve">Gu/Kelly/Xiu, S. 2223</w:t>
       </w:r>
     </w:p>
   </w:footnote>
@@ -10551,7 +10765,7 @@
         <w:t xml:space="preserve"> </w:t>
       </w:r>
       <w:r>
-        <w:t xml:space="preserve">Gu/Kelly/Xiu, S. 2234</w:t>
+        <w:t xml:space="preserve">Gu/Kelly/Xiu, S. 2227</w:t>
       </w:r>
     </w:p>
   </w:footnote>
@@ -10570,7 +10784,7 @@
         <w:t xml:space="preserve"> </w:t>
       </w:r>
       <w:r>
-        <w:t xml:space="preserve">Gu/Kelly/Xiu, S. 2228</w:t>
+        <w:t xml:space="preserve">Gu/Kelly/Xiu, S. 2234</w:t>
       </w:r>
     </w:p>
   </w:footnote>
@@ -10589,26 +10803,26 @@
         <w:t xml:space="preserve"> </w:t>
       </w:r>
       <w:r>
+        <w:t xml:space="preserve">Gu/Kelly/Xiu, S. 2228</w:t>
+      </w:r>
+    </w:p>
+  </w:footnote>
+  <w:footnote w:id="104">
+    <w:p>
+      <w:pPr>
+        <w:pStyle w:val="FootnoteText"/>
+      </w:pPr>
+      <w:r>
+        <w:rPr>
+          <w:rStyle w:val="FootnoteReference"/>
+        </w:rPr>
+        <w:footnoteRef/>
+      </w:r>
+      <w:r>
+        <w:t xml:space="preserve"> </w:t>
+      </w:r>
+      <w:r>
         <w:t xml:space="preserve">Gu/Kelly/Xiu, S. 2225</w:t>
-      </w:r>
-    </w:p>
-  </w:footnote>
-  <w:footnote w:id="107">
-    <w:p>
-      <w:pPr>
-        <w:pStyle w:val="FootnoteText"/>
-      </w:pPr>
-      <w:r>
-        <w:rPr>
-          <w:rStyle w:val="FootnoteReference"/>
-        </w:rPr>
-        <w:footnoteRef/>
-      </w:r>
-      <w:r>
-        <w:t xml:space="preserve"> </w:t>
-      </w:r>
-      <w:r>
-        <w:t xml:space="preserve">Gu/Kelly/Xiu, S. 2223</w:t>
       </w:r>
     </w:p>
   </w:footnote>
@@ -10627,83 +10841,26 @@
         <w:t xml:space="preserve"> </w:t>
       </w:r>
       <w:r>
+        <w:t xml:space="preserve">Gu/Kelly/Xiu, S. 2223</w:t>
+      </w:r>
+    </w:p>
+  </w:footnote>
+  <w:footnote w:id="109">
+    <w:p>
+      <w:pPr>
+        <w:pStyle w:val="FootnoteText"/>
+      </w:pPr>
+      <w:r>
+        <w:rPr>
+          <w:rStyle w:val="FootnoteReference"/>
+        </w:rPr>
+        <w:footnoteRef/>
+      </w:r>
+      <w:r>
+        <w:t xml:space="preserve"> </w:t>
+      </w:r>
+      <w:r>
         <w:t xml:space="preserve">Jegadeesh/Titman, S. 65</w:t>
-      </w:r>
-    </w:p>
-  </w:footnote>
-  <w:footnote w:id="115">
-    <w:p>
-      <w:pPr>
-        <w:pStyle w:val="FootnoteText"/>
-      </w:pPr>
-      <w:r>
-        <w:rPr>
-          <w:rStyle w:val="FootnoteReference"/>
-        </w:rPr>
-        <w:footnoteRef/>
-      </w:r>
-      <w:r>
-        <w:t xml:space="preserve"> </w:t>
-      </w:r>
-      <w:r>
-        <w:t xml:space="preserve">Sharpe, S. 13</w:t>
-      </w:r>
-    </w:p>
-  </w:footnote>
-  <w:footnote w:id="116">
-    <w:p>
-      <w:pPr>
-        <w:pStyle w:val="FootnoteText"/>
-      </w:pPr>
-      <w:r>
-        <w:rPr>
-          <w:rStyle w:val="FootnoteReference"/>
-        </w:rPr>
-        <w:footnoteRef/>
-      </w:r>
-      <w:r>
-        <w:t xml:space="preserve"> </w:t>
-      </w:r>
-      <w:r>
-        <w:t xml:space="preserve">Lo, S. 36</w:t>
-      </w:r>
-    </w:p>
-  </w:footnote>
-  <w:footnote w:id="117">
-    <w:p>
-      <w:pPr>
-        <w:pStyle w:val="FootnoteText"/>
-      </w:pPr>
-      <w:r>
-        <w:rPr>
-          <w:rStyle w:val="FootnoteReference"/>
-        </w:rPr>
-        <w:footnoteRef/>
-      </w:r>
-      <w:r>
-        <w:t xml:space="preserve"> </w:t>
-      </w:r>
-      <w:r>
-        <w:t xml:space="preserve">Ledoit/Wolf 2008, S. 850</w:t>
-      </w:r>
-    </w:p>
-  </w:footnote>
-  <w:footnote w:id="118">
-    <w:p>
-      <w:pPr>
-        <w:pStyle w:val="FootnoteText"/>
-      </w:pPr>
-      <w:r>
-        <w:rPr>
-          <w:rStyle w:val="FootnoteReference"/>
-        </w:rPr>
-        <w:footnoteRef/>
-      </w:r>
-      <w:r>
-        <w:t xml:space="preserve"> </w:t>
-      </w:r>
-      <w:r>
-        <w:t xml:space="preserve">Ledoit/Wolf 2008, S. 850</w:t>
       </w:r>
     </w:p>
   </w:footnote>
@@ -10722,7 +10879,26 @@
         <w:t xml:space="preserve"> </w:t>
       </w:r>
       <w:r>
-        <w:t xml:space="preserve">Ledoit/Wolf 2008, S. 851</w:t>
+        <w:t xml:space="preserve">Sharpe, S. 13</w:t>
+      </w:r>
+    </w:p>
+  </w:footnote>
+  <w:footnote w:id="120">
+    <w:p>
+      <w:pPr>
+        <w:pStyle w:val="FootnoteText"/>
+      </w:pPr>
+      <w:r>
+        <w:rPr>
+          <w:rStyle w:val="FootnoteReference"/>
+        </w:rPr>
+        <w:footnoteRef/>
+      </w:r>
+      <w:r>
+        <w:t xml:space="preserve"> </w:t>
+      </w:r>
+      <w:r>
+        <w:t xml:space="preserve">Lo, S. 36</w:t>
       </w:r>
     </w:p>
   </w:footnote>
@@ -10760,7 +10936,7 @@
         <w:t xml:space="preserve"> </w:t>
       </w:r>
       <w:r>
-        <w:t xml:space="preserve">Ledoit/Wolf 2008, S. 851 f.</w:t>
+        <w:t xml:space="preserve">Ledoit/Wolf 2008, S. 850</w:t>
       </w:r>
     </w:p>
   </w:footnote>
@@ -10779,26 +10955,7 @@
         <w:t xml:space="preserve"> </w:t>
       </w:r>
       <w:r>
-        <w:t xml:space="preserve">Ledoit/Wolf 2008, S. 852</w:t>
-      </w:r>
-    </w:p>
-  </w:footnote>
-  <w:footnote w:id="124">
-    <w:p>
-      <w:pPr>
-        <w:pStyle w:val="FootnoteText"/>
-      </w:pPr>
-      <w:r>
-        <w:rPr>
-          <w:rStyle w:val="FootnoteReference"/>
-        </w:rPr>
-        <w:footnoteRef/>
-      </w:r>
-      <w:r>
-        <w:t xml:space="preserve"> </w:t>
-      </w:r>
-      <w:r>
-        <w:t xml:space="preserve">Ledoit/Wolf 2008, S. 853</w:t>
+        <w:t xml:space="preserve">Ledoit/Wolf 2008, S. 851</w:t>
       </w:r>
     </w:p>
   </w:footnote>
@@ -10817,7 +10974,7 @@
         <w:t xml:space="preserve"> </w:t>
       </w:r>
       <w:r>
-        <w:t xml:space="preserve">Ledoit/Wolf 2008, S. 853</w:t>
+        <w:t xml:space="preserve">Ledoit/Wolf 2008, S. 850</w:t>
       </w:r>
     </w:p>
   </w:footnote>
@@ -10836,7 +10993,7 @@
         <w:t xml:space="preserve"> </w:t>
       </w:r>
       <w:r>
-        <w:t xml:space="preserve">Ledoit/Wolf 2008, S. 853</w:t>
+        <w:t xml:space="preserve">Ledoit/Wolf 2008, S. 851 f.</w:t>
       </w:r>
     </w:p>
   </w:footnote>
@@ -10855,7 +11012,7 @@
         <w:t xml:space="preserve"> </w:t>
       </w:r>
       <w:r>
-        <w:t xml:space="preserve">Ledoit/Wolf 2008, S. 854</w:t>
+        <w:t xml:space="preserve">Ledoit/Wolf 2008, S. 852</w:t>
       </w:r>
     </w:p>
   </w:footnote>
@@ -10874,7 +11031,7 @@
         <w:t xml:space="preserve"> </w:t>
       </w:r>
       <w:r>
-        <w:t xml:space="preserve">Politis/Romano, S. 1303</w:t>
+        <w:t xml:space="preserve">Ledoit/Wolf 2008, S. 853</w:t>
       </w:r>
     </w:p>
   </w:footnote>
@@ -10897,6 +11054,25 @@
       </w:r>
     </w:p>
   </w:footnote>
+  <w:footnote w:id="130">
+    <w:p>
+      <w:pPr>
+        <w:pStyle w:val="FootnoteText"/>
+      </w:pPr>
+      <w:r>
+        <w:rPr>
+          <w:rStyle w:val="FootnoteReference"/>
+        </w:rPr>
+        <w:footnoteRef/>
+      </w:r>
+      <w:r>
+        <w:t xml:space="preserve"> </w:t>
+      </w:r>
+      <w:r>
+        <w:t xml:space="preserve">Ledoit/Wolf 2008, S. 853</w:t>
+      </w:r>
+    </w:p>
+  </w:footnote>
   <w:footnote w:id="131">
     <w:p>
       <w:pPr>
@@ -10912,7 +11088,7 @@
         <w:t xml:space="preserve"> </w:t>
       </w:r>
       <w:r>
-        <w:t xml:space="preserve">Harvey/Liu/Zhu, S. 5</w:t>
+        <w:t xml:space="preserve">Ledoit/Wolf 2008, S. 854</w:t>
       </w:r>
     </w:p>
   </w:footnote>
@@ -10931,7 +11107,7 @@
         <w:t xml:space="preserve"> </w:t>
       </w:r>
       <w:r>
-        <w:t xml:space="preserve">Harvey/Liu/Zhu, S. 1</w:t>
+        <w:t xml:space="preserve">Politis/Romano, S. 1303</w:t>
       </w:r>
     </w:p>
   </w:footnote>
@@ -10950,26 +11126,7 @@
         <w:t xml:space="preserve"> </w:t>
       </w:r>
       <w:r>
-        <w:t xml:space="preserve">Harvey/Liu/Zhu, S. 9</w:t>
-      </w:r>
-    </w:p>
-  </w:footnote>
-  <w:footnote w:id="134">
-    <w:p>
-      <w:pPr>
-        <w:pStyle w:val="FootnoteText"/>
-      </w:pPr>
-      <w:r>
-        <w:rPr>
-          <w:rStyle w:val="FootnoteReference"/>
-        </w:rPr>
-        <w:footnoteRef/>
-      </w:r>
-      <w:r>
-        <w:t xml:space="preserve"> </w:t>
-      </w:r>
-      <w:r>
-        <w:t xml:space="preserve">Harvey/Liu/Zhu, S. 9</w:t>
+        <w:t xml:space="preserve">Ledoit/Wolf 2008, S. 853</w:t>
       </w:r>
     </w:p>
   </w:footnote>
@@ -10988,7 +11145,7 @@
         <w:t xml:space="preserve"> </w:t>
       </w:r>
       <w:r>
-        <w:t xml:space="preserve">Harvey/Liu/Zhu, S. 11</w:t>
+        <w:t xml:space="preserve">Harvey/Liu/Zhu, S. 5</w:t>
       </w:r>
     </w:p>
   </w:footnote>
@@ -11007,7 +11164,26 @@
         <w:t xml:space="preserve"> </w:t>
       </w:r>
       <w:r>
-        <w:t xml:space="preserve">Holm, S. 65</w:t>
+        <w:t xml:space="preserve">Harvey/Liu/Zhu, S. 1</w:t>
+      </w:r>
+    </w:p>
+  </w:footnote>
+  <w:footnote w:id="137">
+    <w:p>
+      <w:pPr>
+        <w:pStyle w:val="FootnoteText"/>
+      </w:pPr>
+      <w:r>
+        <w:rPr>
+          <w:rStyle w:val="FootnoteReference"/>
+        </w:rPr>
+        <w:footnoteRef/>
+      </w:r>
+      <w:r>
+        <w:t xml:space="preserve"> </w:t>
+      </w:r>
+      <w:r>
+        <w:t xml:space="preserve">Harvey/Liu/Zhu, S. 9</w:t>
       </w:r>
     </w:p>
   </w:footnote>
@@ -11026,7 +11202,7 @@
         <w:t xml:space="preserve"> </w:t>
       </w:r>
       <w:r>
-        <w:t xml:space="preserve">Bailey/López de Prado, S. 2 u. 6</w:t>
+        <w:t xml:space="preserve">Harvey/Liu/Zhu, S. 9</w:t>
       </w:r>
     </w:p>
   </w:footnote>
@@ -11045,7 +11221,7 @@
         <w:t xml:space="preserve"> </w:t>
       </w:r>
       <w:r>
-        <w:t xml:space="preserve">Bailey et al., S. 1 u. 4</w:t>
+        <w:t xml:space="preserve">Harvey/Liu/Zhu, S. 11</w:t>
       </w:r>
     </w:p>
   </w:footnote>
@@ -11064,26 +11240,7 @@
         <w:t xml:space="preserve"> </w:t>
       </w:r>
       <w:r>
-        <w:t xml:space="preserve">Bailey/López de Prado, S. 7</w:t>
-      </w:r>
-    </w:p>
-  </w:footnote>
-  <w:footnote w:id="141">
-    <w:p>
-      <w:pPr>
-        <w:pStyle w:val="FootnoteText"/>
-      </w:pPr>
-      <w:r>
-        <w:rPr>
-          <w:rStyle w:val="FootnoteReference"/>
-        </w:rPr>
-        <w:footnoteRef/>
-      </w:r>
-      <w:r>
-        <w:t xml:space="preserve"> </w:t>
-      </w:r>
-      <w:r>
-        <w:t xml:space="preserve">Bailey/López de Prado, S. 8</w:t>
+        <w:t xml:space="preserve">Holm, S. 65</w:t>
       </w:r>
     </w:p>
   </w:footnote>
@@ -11102,7 +11259,7 @@
         <w:t xml:space="preserve"> </w:t>
       </w:r>
       <w:r>
-        <w:t xml:space="preserve">Bailey/López de Prado, S. 2</w:t>
+        <w:t xml:space="preserve">Bailey/López de Prado, S. 2 u. 6</w:t>
       </w:r>
     </w:p>
   </w:footnote>
@@ -11121,7 +11278,7 @@
         <w:t xml:space="preserve"> </w:t>
       </w:r>
       <w:r>
-        <w:t xml:space="preserve">Bailey/López de Prado, S. 7 f.</w:t>
+        <w:t xml:space="preserve">Bailey et al., S. 1 u. 4</w:t>
       </w:r>
     </w:p>
   </w:footnote>
@@ -11140,7 +11297,7 @@
         <w:t xml:space="preserve"> </w:t>
       </w:r>
       <w:r>
-        <w:t xml:space="preserve">Bailey/López de Prado, S. 8</w:t>
+        <w:t xml:space="preserve">Bailey/López de Prado, S. 7</w:t>
       </w:r>
     </w:p>
   </w:footnote>
@@ -11159,6 +11316,25 @@
         <w:t xml:space="preserve"> </w:t>
       </w:r>
       <w:r>
+        <w:t xml:space="preserve">Bailey/López de Prado, S. 8</w:t>
+      </w:r>
+    </w:p>
+  </w:footnote>
+  <w:footnote w:id="146">
+    <w:p>
+      <w:pPr>
+        <w:pStyle w:val="FootnoteText"/>
+      </w:pPr>
+      <w:r>
+        <w:rPr>
+          <w:rStyle w:val="FootnoteReference"/>
+        </w:rPr>
+        <w:footnoteRef/>
+      </w:r>
+      <w:r>
+        <w:t xml:space="preserve"> </w:t>
+      </w:r>
+      <w:r>
         <w:t xml:space="preserve">Bailey/López de Prado, S. 2</w:t>
       </w:r>
     </w:p>
@@ -11178,7 +11354,7 @@
         <w:t xml:space="preserve"> </w:t>
       </w:r>
       <w:r>
-        <w:t xml:space="preserve">López de Prado, S. 104</w:t>
+        <w:t xml:space="preserve">Bailey/López de Prado, S. 7 f.</w:t>
       </w:r>
     </w:p>
   </w:footnote>
@@ -11197,7 +11373,7 @@
         <w:t xml:space="preserve"> </w:t>
       </w:r>
       <w:r>
-        <w:t xml:space="preserve">López de Prado, S. 105</w:t>
+        <w:t xml:space="preserve">Bailey/López de Prado, S. 8</w:t>
       </w:r>
     </w:p>
   </w:footnote>
@@ -11216,26 +11392,7 @@
         <w:t xml:space="preserve"> </w:t>
       </w:r>
       <w:r>
-        <w:t xml:space="preserve">López de Prado, S. 105</w:t>
-      </w:r>
-    </w:p>
-  </w:footnote>
-  <w:footnote w:id="150">
-    <w:p>
-      <w:pPr>
-        <w:pStyle w:val="FootnoteText"/>
-      </w:pPr>
-      <w:r>
-        <w:rPr>
-          <w:rStyle w:val="FootnoteReference"/>
-        </w:rPr>
-        <w:footnoteRef/>
-      </w:r>
-      <w:r>
-        <w:t xml:space="preserve"> </w:t>
-      </w:r>
-      <w:r>
-        <w:t xml:space="preserve">López de Prado, S. 105</w:t>
+        <w:t xml:space="preserve">Bailey/López de Prado, S. 2</w:t>
       </w:r>
     </w:p>
   </w:footnote>
@@ -11254,11 +11411,87 @@
         <w:t xml:space="preserve"> </w:t>
       </w:r>
       <w:r>
+        <w:t xml:space="preserve">López de Prado, S. 104</w:t>
+      </w:r>
+    </w:p>
+  </w:footnote>
+  <w:footnote w:id="152">
+    <w:p>
+      <w:pPr>
+        <w:pStyle w:val="FootnoteText"/>
+      </w:pPr>
+      <w:r>
+        <w:rPr>
+          <w:rStyle w:val="FootnoteReference"/>
+        </w:rPr>
+        <w:footnoteRef/>
+      </w:r>
+      <w:r>
+        <w:t xml:space="preserve"> </w:t>
+      </w:r>
+      <w:r>
+        <w:t xml:space="preserve">López de Prado, S. 105</w:t>
+      </w:r>
+    </w:p>
+  </w:footnote>
+  <w:footnote w:id="153">
+    <w:p>
+      <w:pPr>
+        <w:pStyle w:val="FootnoteText"/>
+      </w:pPr>
+      <w:r>
+        <w:rPr>
+          <w:rStyle w:val="FootnoteReference"/>
+        </w:rPr>
+        <w:footnoteRef/>
+      </w:r>
+      <w:r>
+        <w:t xml:space="preserve"> </w:t>
+      </w:r>
+      <w:r>
+        <w:t xml:space="preserve">López de Prado, S. 105</w:t>
+      </w:r>
+    </w:p>
+  </w:footnote>
+  <w:footnote w:id="154">
+    <w:p>
+      <w:pPr>
+        <w:pStyle w:val="FootnoteText"/>
+      </w:pPr>
+      <w:r>
+        <w:rPr>
+          <w:rStyle w:val="FootnoteReference"/>
+        </w:rPr>
+        <w:footnoteRef/>
+      </w:r>
+      <w:r>
+        <w:t xml:space="preserve"> </w:t>
+      </w:r>
+      <w:r>
+        <w:t xml:space="preserve">López de Prado, S. 105</w:t>
+      </w:r>
+    </w:p>
+  </w:footnote>
+  <w:footnote w:id="155">
+    <w:p>
+      <w:pPr>
+        <w:pStyle w:val="FootnoteText"/>
+      </w:pPr>
+      <w:r>
+        <w:rPr>
+          <w:rStyle w:val="FootnoteReference"/>
+        </w:rPr>
+        <w:footnoteRef/>
+      </w:r>
+      <w:r>
+        <w:t xml:space="preserve"> </w:t>
+      </w:r>
+      <w:r>
         <w:t xml:space="preserve">López de Prado, S. 107</w:t>
       </w:r>
     </w:p>
   </w:footnote>
-  <w:footnote w:id="162">
+  <w:footnote w:id="172">
     <w:p>
       <w:pPr>
         <w:pStyle w:val="FootnoteText"/>
@@ -11277,7 +11510,7 @@
       </w:r>
     </w:p>
   </w:footnote>
-  <w:footnote w:id="164">
+  <w:footnote w:id="174">
     <w:p>
       <w:pPr>
         <w:pStyle w:val="FootnoteText"/>
@@ -11293,6 +11526,44 @@
       </w:r>
       <w:r>
         <w:t xml:space="preserve">Almgren/Chriss, S. 1</w:t>
+      </w:r>
+    </w:p>
+  </w:footnote>
+  <w:footnote w:id="178">
+    <w:p>
+      <w:pPr>
+        <w:pStyle w:val="FootnoteText"/>
+      </w:pPr>
+      <w:r>
+        <w:rPr>
+          <w:rStyle w:val="FootnoteReference"/>
+        </w:rPr>
+        <w:footnoteRef/>
+      </w:r>
+      <w:r>
+        <w:t xml:space="preserve"> </w:t>
+      </w:r>
+      <w:r>
+        <w:t xml:space="preserve">Ledoit/Wolf 2017, S. 4349</w:t>
+      </w:r>
+    </w:p>
+  </w:footnote>
+  <w:footnote w:id="179">
+    <w:p>
+      <w:pPr>
+        <w:pStyle w:val="FootnoteText"/>
+      </w:pPr>
+      <w:r>
+        <w:rPr>
+          <w:rStyle w:val="FootnoteReference"/>
+        </w:rPr>
+        <w:footnoteRef/>
+      </w:r>
+      <w:r>
+        <w:t xml:space="preserve"> </w:t>
+      </w:r>
+      <w:r>
+        <w:t xml:space="preserve">Black/Litterman, S. 28</w:t>
       </w:r>
     </w:p>
   </w:footnote>

</xml_diff>